<commit_message>
Add updated content, TCs document and link to submission form
</commit_message>
<xml_diff>
--- a/FERTILITY_Invisible_Journeys_Terms_and_Conditions.docx
+++ b/FERTILITY_Invisible_Journeys_Terms_and_Conditions.docx
@@ -14,26 +14,10 @@
           <w:color w:val="000000" w:themeColor="text1"/>
         </w:rPr>
         <w:drawing>
-          <wp:anchor distT="0" distB="0" distL="114300" distR="114300" simplePos="0" relativeHeight="251658240" behindDoc="1" locked="0" layoutInCell="1" allowOverlap="1" wp14:anchorId="604DA834" wp14:editId="7BA4A7D4">
-            <wp:simplePos x="0" y="0"/>
-            <wp:positionH relativeFrom="column">
-              <wp:posOffset>5086918</wp:posOffset>
-            </wp:positionH>
-            <wp:positionV relativeFrom="paragraph">
-              <wp:posOffset>42883</wp:posOffset>
-            </wp:positionV>
-            <wp:extent cx="1517015" cy="1517015"/>
+          <wp:inline distT="0" distB="0" distL="0" distR="0" wp14:anchorId="34DCE782" wp14:editId="51D99CA1">
+            <wp:extent cx="6331053" cy="2381062"/>
             <wp:effectExtent l="0" t="0" r="0" b="0"/>
-            <wp:wrapTight wrapText="bothSides">
-              <wp:wrapPolygon edited="0">
-                <wp:start x="0" y="0"/>
-                <wp:lineTo x="0" y="21338"/>
-                <wp:lineTo x="21338" y="21338"/>
-                <wp:lineTo x="21338" y="0"/>
-                <wp:lineTo x="0" y="0"/>
-              </wp:wrapPolygon>
-            </wp:wrapTight>
-            <wp:docPr id="1793689413" name="Picture 1"/>
+            <wp:docPr id="747689526" name="Picture 4"/>
             <wp:cNvGraphicFramePr>
               <a:graphicFrameLocks xmlns:a="http://schemas.openxmlformats.org/drawingml/2006/main" noChangeAspect="1"/>
             </wp:cNvGraphicFramePr>
@@ -41,71 +25,49 @@
               <a:graphicData uri="http://schemas.openxmlformats.org/drawingml/2006/picture">
                 <pic:pic xmlns:pic="http://schemas.openxmlformats.org/drawingml/2006/picture">
                   <pic:nvPicPr>
-                    <pic:cNvPr id="1793689413" name="Picture 1793689413"/>
+                    <pic:cNvPr id="747689526" name="Picture 747689526"/>
                     <pic:cNvPicPr/>
                   </pic:nvPicPr>
-                  <pic:blipFill>
+                  <pic:blipFill rotWithShape="1">
                     <a:blip r:embed="rId6"/>
+                    <a:srcRect t="4885" b="9432"/>
                     <a:stretch>
                       <a:fillRect/>
                     </a:stretch>
                   </pic:blipFill>
-                  <pic:spPr>
+                  <pic:spPr bwMode="auto">
                     <a:xfrm>
                       <a:off x="0" y="0"/>
-                      <a:ext cx="1517015" cy="1517015"/>
+                      <a:ext cx="6357867" cy="2391147"/>
                     </a:xfrm>
                     <a:prstGeom prst="rect">
                       <a:avLst/>
                     </a:prstGeom>
+                    <a:ln>
+                      <a:noFill/>
+                    </a:ln>
+                    <a:extLst>
+                      <a:ext uri="{53640926-AAD7-44D8-BBD7-CCE9431645EC}">
+                        <a14:shadowObscured xmlns:a14="http://schemas.microsoft.com/office/drawing/2010/main"/>
+                      </a:ext>
+                    </a:extLst>
                   </pic:spPr>
                 </pic:pic>
               </a:graphicData>
             </a:graphic>
-            <wp14:sizeRelH relativeFrom="page">
-              <wp14:pctWidth>0</wp14:pctWidth>
-            </wp14:sizeRelH>
-            <wp14:sizeRelV relativeFrom="page">
-              <wp14:pctHeight>0</wp14:pctHeight>
-            </wp14:sizeRelV>
-          </wp:anchor>
+          </wp:inline>
         </w:drawing>
-      </w:r>
-      <w:r>
-        <w:rPr>
-          <w:b/>
-          <w:color w:val="000000" w:themeColor="text1"/>
-          <w:sz w:val="17"/>
-        </w:rPr>
-        <w:t>OPEN CALL</w:t>
       </w:r>
     </w:p>
     <w:p>
       <w:pPr>
-        <w:pStyle w:val="Title"/>
-        <w:rPr>
-          <w:color w:val="000000" w:themeColor="text1"/>
-        </w:rPr>
-      </w:pPr>
-      <w:r>
-        <w:rPr>
-          <w:color w:val="000000" w:themeColor="text1"/>
-        </w:rPr>
-        <w:t>FERTILITY:</w:t>
-      </w:r>
-      <w:r>
-        <w:rPr>
-          <w:color w:val="000000" w:themeColor="text1"/>
-        </w:rPr>
-        <w:br/>
-      </w:r>
-      <w:r>
-        <w:rPr>
-          <w:color w:val="000000" w:themeColor="text1"/>
-          <w:sz w:val="44"/>
-        </w:rPr>
-        <w:t>Invisible Journeys</w:t>
-      </w:r>
+        <w:rPr>
+          <w:b/>
+          <w:bCs/>
+          <w:color w:val="000000" w:themeColor="text1"/>
+          <w:sz w:val="26"/>
+        </w:rPr>
+      </w:pPr>
     </w:p>
     <w:p>
       <w:pPr>
@@ -154,14 +116,16 @@
         <w:rPr>
           <w:b/>
           <w:color w:val="000000" w:themeColor="text1"/>
-          <w:sz w:val="17"/>
+          <w:sz w:val="24"/>
+          <w:szCs w:val="24"/>
         </w:rPr>
       </w:pPr>
       <w:r>
         <w:rPr>
           <w:b/>
           <w:color w:val="000000" w:themeColor="text1"/>
-          <w:sz w:val="17"/>
+          <w:sz w:val="24"/>
+          <w:szCs w:val="24"/>
         </w:rPr>
         <w:t>THE EXHIBITION</w:t>
       </w:r>
@@ -197,7 +161,39 @@
         <w:rPr>
           <w:color w:val="000000" w:themeColor="text1"/>
         </w:rPr>
-        <w:t>Fertility: Invisible Journeys is an open exhibition that invites artists and creatives to explore the diverse realities of fertility and reproductive health. We welcome work that reflects the biological, emotional, social, cultural, and environmental dimensions of fertility, helping to raise awareness, encourage conversation, and reduce stigma.</w:t>
+        <w:t xml:space="preserve">Fertility: Invisible Journeys is an open exhibition that invites artists and creatives </w:t>
+      </w:r>
+      <w:r>
+        <w:rPr>
+          <w:color w:val="000000" w:themeColor="text1"/>
+        </w:rPr>
+        <w:t>based in London,</w:t>
+      </w:r>
+      <w:r>
+        <w:rPr>
+          <w:color w:val="000000" w:themeColor="text1"/>
+        </w:rPr>
+        <w:t xml:space="preserve"> the </w:t>
+      </w:r>
+      <w:proofErr w:type="gramStart"/>
+      <w:r>
+        <w:rPr>
+          <w:color w:val="000000" w:themeColor="text1"/>
+        </w:rPr>
+        <w:t>South East</w:t>
+      </w:r>
+      <w:proofErr w:type="gramEnd"/>
+      <w:r>
+        <w:rPr>
+          <w:color w:val="000000" w:themeColor="text1"/>
+        </w:rPr>
+        <w:t xml:space="preserve"> and East of England </w:t>
+      </w:r>
+      <w:r>
+        <w:rPr>
+          <w:color w:val="000000" w:themeColor="text1"/>
+        </w:rPr>
+        <w:t>to explore the diverse realities of fertility and reproductive health. We welcome work that reflects the biological, emotional, social, cultural, and environmental dimensions of fertility, helping to raise awareness, encourage conversation, and reduce stigma.</w:t>
       </w:r>
     </w:p>
     <w:p>
@@ -210,7 +206,21 @@
         <w:rPr>
           <w:color w:val="000000" w:themeColor="text1"/>
         </w:rPr>
-        <w:t>We encourage diverse interpretations of these themes and welcome work that challenges assumptions, sparks dialogue, and promotes greater understanding.</w:t>
+        <w:t xml:space="preserve">We encourage diverse interpretations of these themes and welcome work that challenges assumptions, sparks </w:t>
+      </w:r>
+      <w:proofErr w:type="gramStart"/>
+      <w:r>
+        <w:rPr>
+          <w:color w:val="000000" w:themeColor="text1"/>
+        </w:rPr>
+        <w:t>dialogue, and</w:t>
+      </w:r>
+      <w:proofErr w:type="gramEnd"/>
+      <w:r>
+        <w:rPr>
+          <w:color w:val="000000" w:themeColor="text1"/>
+        </w:rPr>
+        <w:t xml:space="preserve"> promotes greater understanding.</w:t>
       </w:r>
     </w:p>
     <w:p>
@@ -438,6 +448,7 @@
         <w:rPr>
           <w:color w:val="000000" w:themeColor="text1"/>
         </w:rPr>
+        <w:lastRenderedPageBreak/>
         <w:t>Printmakers</w:t>
       </w:r>
     </w:p>
@@ -469,67 +480,83 @@
         </w:rPr>
         <w:t>No previous exhibition experience is required.</w:t>
       </w:r>
+      <w:r>
+        <w:rPr>
+          <w:b/>
+          <w:color w:val="000000" w:themeColor="text1"/>
+        </w:rPr>
+        <w:t xml:space="preserve"> </w:t>
+      </w:r>
     </w:p>
     <w:p>
       <w:pPr>
         <w:rPr>
-          <w:b/>
-          <w:color w:val="000000" w:themeColor="text1"/>
-          <w:sz w:val="17"/>
+          <w:color w:val="000000" w:themeColor="text1"/>
         </w:rPr>
       </w:pPr>
     </w:p>
     <w:p>
       <w:pPr>
         <w:rPr>
+          <w:color w:val="000000" w:themeColor="text1"/>
+        </w:rPr>
+      </w:pPr>
+      <w:r>
+        <w:rPr>
           <w:b/>
           <w:color w:val="000000" w:themeColor="text1"/>
           <w:sz w:val="17"/>
         </w:rPr>
-      </w:pPr>
+        <w:t>ACCEPTED MEDIA</w:t>
+      </w:r>
     </w:p>
     <w:p>
       <w:pPr>
-        <w:rPr>
-          <w:b/>
-          <w:color w:val="000000" w:themeColor="text1"/>
-          <w:sz w:val="17"/>
-        </w:rPr>
-      </w:pPr>
+        <w:pStyle w:val="Heading1"/>
+        <w:spacing w:before="0"/>
+        <w:rPr>
+          <w:color w:val="000000" w:themeColor="text1"/>
+          <w:sz w:val="24"/>
+          <w:szCs w:val="24"/>
+        </w:rPr>
+      </w:pPr>
+      <w:r>
+        <w:rPr>
+          <w:color w:val="000000" w:themeColor="text1"/>
+          <w:sz w:val="24"/>
+          <w:szCs w:val="24"/>
+        </w:rPr>
+        <w:t>What you can submit.</w:t>
+      </w:r>
     </w:p>
     <w:p>
       <w:pPr>
-        <w:rPr>
-          <w:color w:val="000000" w:themeColor="text1"/>
-        </w:rPr>
-      </w:pPr>
-      <w:r>
-        <w:rPr>
-          <w:b/>
-          <w:color w:val="000000" w:themeColor="text1"/>
-          <w:sz w:val="17"/>
-        </w:rPr>
-        <w:lastRenderedPageBreak/>
-        <w:t>ACCEPTED MEDIA</w:t>
+        <w:pStyle w:val="ListBullet"/>
+        <w:spacing w:after="80"/>
+        <w:rPr>
+          <w:color w:val="000000" w:themeColor="text1"/>
+        </w:rPr>
+      </w:pPr>
+      <w:r>
+        <w:rPr>
+          <w:color w:val="000000" w:themeColor="text1"/>
+        </w:rPr>
+        <w:t>Painting</w:t>
       </w:r>
     </w:p>
     <w:p>
       <w:pPr>
-        <w:pStyle w:val="Heading1"/>
-        <w:spacing w:before="0"/>
-        <w:rPr>
-          <w:color w:val="000000" w:themeColor="text1"/>
-          <w:sz w:val="24"/>
-          <w:szCs w:val="24"/>
-        </w:rPr>
-      </w:pPr>
-      <w:r>
-        <w:rPr>
-          <w:color w:val="000000" w:themeColor="text1"/>
-          <w:sz w:val="24"/>
-          <w:szCs w:val="24"/>
-        </w:rPr>
-        <w:t>What you can submit.</w:t>
+        <w:pStyle w:val="ListBullet"/>
+        <w:spacing w:after="80"/>
+        <w:rPr>
+          <w:color w:val="000000" w:themeColor="text1"/>
+        </w:rPr>
+      </w:pPr>
+      <w:r>
+        <w:rPr>
+          <w:color w:val="000000" w:themeColor="text1"/>
+        </w:rPr>
+        <w:t>Photography</w:t>
       </w:r>
     </w:p>
     <w:p>
@@ -544,7 +571,7 @@
         <w:rPr>
           <w:color w:val="000000" w:themeColor="text1"/>
         </w:rPr>
-        <w:t>Painting</w:t>
+        <w:t>Drawing</w:t>
       </w:r>
     </w:p>
     <w:p>
@@ -559,7 +586,7 @@
         <w:rPr>
           <w:color w:val="000000" w:themeColor="text1"/>
         </w:rPr>
-        <w:t>Photography</w:t>
+        <w:t>Printmaking</w:t>
       </w:r>
     </w:p>
     <w:p>
@@ -574,7 +601,7 @@
         <w:rPr>
           <w:color w:val="000000" w:themeColor="text1"/>
         </w:rPr>
-        <w:t>Drawing</w:t>
+        <w:t>Sculpture</w:t>
       </w:r>
     </w:p>
     <w:p>
@@ -589,7 +616,7 @@
         <w:rPr>
           <w:color w:val="000000" w:themeColor="text1"/>
         </w:rPr>
-        <w:t>Printmaking</w:t>
+        <w:t>Textile art</w:t>
       </w:r>
     </w:p>
     <w:p>
@@ -604,7 +631,7 @@
         <w:rPr>
           <w:color w:val="000000" w:themeColor="text1"/>
         </w:rPr>
-        <w:t>Sculpture</w:t>
+        <w:t>Mixed media</w:t>
       </w:r>
     </w:p>
     <w:p>
@@ -619,7 +646,13 @@
         <w:rPr>
           <w:color w:val="000000" w:themeColor="text1"/>
         </w:rPr>
-        <w:t>Textile art</w:t>
+        <w:t xml:space="preserve">Short </w:t>
+      </w:r>
+      <w:r>
+        <w:rPr>
+          <w:color w:val="000000" w:themeColor="text1"/>
+        </w:rPr>
+        <w:t>film</w:t>
       </w:r>
     </w:p>
     <w:p>
@@ -634,207 +667,43 @@
         <w:rPr>
           <w:color w:val="000000" w:themeColor="text1"/>
         </w:rPr>
-        <w:t>Mixed media</w:t>
-      </w:r>
-    </w:p>
-    <w:p>
-      <w:pPr>
-        <w:pStyle w:val="ListBullet"/>
-        <w:spacing w:after="80"/>
-        <w:rPr>
-          <w:color w:val="000000" w:themeColor="text1"/>
-        </w:rPr>
-      </w:pPr>
-      <w:r>
-        <w:rPr>
-          <w:color w:val="000000" w:themeColor="text1"/>
-        </w:rPr>
-        <w:t>Video or short film</w:t>
-      </w:r>
-    </w:p>
-    <w:p>
-      <w:pPr>
-        <w:pStyle w:val="ListBullet"/>
-        <w:spacing w:after="80"/>
-        <w:rPr>
-          <w:color w:val="000000" w:themeColor="text1"/>
-        </w:rPr>
-      </w:pPr>
-      <w:r>
-        <w:rPr>
-          <w:color w:val="000000" w:themeColor="text1"/>
-        </w:rPr>
-        <w:t>Short story</w:t>
-      </w:r>
-    </w:p>
-    <w:p>
-      <w:pPr>
-        <w:rPr>
-          <w:b/>
-          <w:color w:val="000000" w:themeColor="text1"/>
-        </w:rPr>
-      </w:pPr>
-      <w:r>
-        <w:rPr>
-          <w:b/>
-          <w:color w:val="000000" w:themeColor="text1"/>
-        </w:rPr>
-        <w:t>Size requirement</w:t>
-      </w:r>
-      <w:r>
-        <w:rPr>
-          <w:b/>
-          <w:color w:val="000000" w:themeColor="text1"/>
-        </w:rPr>
-        <w:t>s</w:t>
-      </w:r>
-      <w:r>
-        <w:rPr>
-          <w:b/>
-          <w:color w:val="000000" w:themeColor="text1"/>
-        </w:rPr>
-        <w:t xml:space="preserve">: </w:t>
-      </w:r>
-    </w:p>
-    <w:p>
-      <w:pPr>
-        <w:pStyle w:val="ListParagraph"/>
-        <w:numPr>
-          <w:ilvl w:val="0"/>
-          <w:numId w:val="13"/>
-        </w:numPr>
-        <w:rPr>
-          <w:color w:val="000000" w:themeColor="text1"/>
-        </w:rPr>
-      </w:pPr>
-      <w:r>
-        <w:rPr>
-          <w:color w:val="000000" w:themeColor="text1"/>
-        </w:rPr>
-        <w:t>All 2D works must be no larger than A2.</w:t>
-      </w:r>
-    </w:p>
-    <w:p>
-      <w:pPr>
-        <w:pStyle w:val="ListParagraph"/>
-        <w:numPr>
-          <w:ilvl w:val="0"/>
-          <w:numId w:val="13"/>
-        </w:numPr>
-        <w:rPr>
-          <w:color w:val="000000" w:themeColor="text1"/>
-        </w:rPr>
-      </w:pPr>
-      <w:r>
-        <w:rPr>
-          <w:color w:val="000000" w:themeColor="text1"/>
-        </w:rPr>
-        <w:t>All sculptural works must not exceed 100cm in height.</w:t>
-      </w:r>
-    </w:p>
-    <w:p>
-      <w:pPr>
-        <w:rPr>
-          <w:b/>
-          <w:color w:val="000000" w:themeColor="text1"/>
-          <w:sz w:val="17"/>
-        </w:rPr>
-      </w:pPr>
-    </w:p>
-    <w:p>
-      <w:pPr>
-        <w:rPr>
-          <w:b/>
-          <w:color w:val="000000" w:themeColor="text1"/>
-          <w:sz w:val="17"/>
-        </w:rPr>
-      </w:pPr>
-      <w:r>
-        <w:rPr>
-          <w:b/>
-          <w:color w:val="000000" w:themeColor="text1"/>
-          <w:sz w:val="17"/>
-        </w:rPr>
-        <w:t>SELECTION PROCESS</w:t>
-      </w:r>
-    </w:p>
-    <w:p>
-      <w:pPr>
-        <w:rPr>
-          <w:b/>
-          <w:bCs/>
-          <w:color w:val="000000" w:themeColor="text1"/>
-        </w:rPr>
-      </w:pPr>
-      <w:r>
-        <w:rPr>
-          <w:b/>
-          <w:bCs/>
-          <w:color w:val="000000" w:themeColor="text1"/>
-          <w:sz w:val="24"/>
-          <w:szCs w:val="24"/>
-        </w:rPr>
-        <w:t>How works will be selected.</w:t>
-      </w:r>
-    </w:p>
-    <w:p>
-      <w:pPr>
-        <w:pStyle w:val="ListBullet"/>
-        <w:spacing w:after="80"/>
-        <w:rPr>
-          <w:color w:val="000000" w:themeColor="text1"/>
-        </w:rPr>
-      </w:pPr>
-      <w:r>
-        <w:rPr>
-          <w:color w:val="000000" w:themeColor="text1"/>
-        </w:rPr>
-        <w:t>A selection committee of five jury members will select the works for the exhibition.</w:t>
-      </w:r>
-    </w:p>
-    <w:p>
-      <w:pPr>
-        <w:pStyle w:val="ListBullet"/>
-        <w:spacing w:after="80"/>
-        <w:rPr>
-          <w:color w:val="000000" w:themeColor="text1"/>
-        </w:rPr>
-      </w:pPr>
-      <w:r>
-        <w:rPr>
-          <w:color w:val="000000" w:themeColor="text1"/>
-        </w:rPr>
-        <w:t>Selection will be conducted blind.</w:t>
-      </w:r>
-    </w:p>
-    <w:p>
-      <w:pPr>
-        <w:pStyle w:val="ListBullet"/>
-        <w:spacing w:after="80"/>
-        <w:rPr>
-          <w:color w:val="000000" w:themeColor="text1"/>
-        </w:rPr>
-      </w:pPr>
-      <w:r>
-        <w:rPr>
-          <w:color w:val="000000" w:themeColor="text1"/>
-        </w:rPr>
-        <w:t>The committee will comprise practising artists, gallery staff and individuals with lived experience of subfertility.</w:t>
-      </w:r>
-    </w:p>
-    <w:p>
-      <w:pPr>
-        <w:pStyle w:val="ListBullet"/>
-        <w:spacing w:after="80"/>
-        <w:rPr>
-          <w:color w:val="000000" w:themeColor="text1"/>
-        </w:rPr>
-      </w:pPr>
-      <w:r>
-        <w:rPr>
-          <w:color w:val="000000" w:themeColor="text1"/>
-        </w:rPr>
-        <w:t>The committee brings together artistic, curatorial and lived-experience perspectives.</w:t>
+        <w:t>Personal narrative</w:t>
+      </w:r>
+      <w:r>
+        <w:rPr>
+          <w:color w:val="000000" w:themeColor="text1"/>
+        </w:rPr>
+        <w:t xml:space="preserve"> </w:t>
+      </w:r>
+      <w:r>
+        <w:rPr>
+          <w:color w:val="000000" w:themeColor="text1"/>
+        </w:rPr>
+        <w:t>/</w:t>
+      </w:r>
+      <w:r>
+        <w:rPr>
+          <w:color w:val="000000" w:themeColor="text1"/>
+        </w:rPr>
+        <w:t xml:space="preserve"> </w:t>
+      </w:r>
+      <w:r>
+        <w:rPr>
+          <w:color w:val="000000" w:themeColor="text1"/>
+        </w:rPr>
+        <w:t>lived experience</w:t>
+      </w:r>
+      <w:r>
+        <w:rPr>
+          <w:color w:val="000000" w:themeColor="text1"/>
+        </w:rPr>
+        <w:t xml:space="preserve"> account</w:t>
+      </w:r>
+      <w:r>
+        <w:rPr>
+          <w:color w:val="000000" w:themeColor="text1"/>
+        </w:rPr>
+        <w:t>*</w:t>
       </w:r>
     </w:p>
     <w:p>
@@ -853,44 +722,102 @@
     </w:p>
     <w:p>
       <w:pPr>
-        <w:rPr>
-          <w:color w:val="000000" w:themeColor="text1"/>
-        </w:rPr>
-      </w:pPr>
-      <w:r>
-        <w:rPr>
-          <w:b/>
-          <w:color w:val="000000" w:themeColor="text1"/>
-          <w:sz w:val="17"/>
-        </w:rPr>
-        <w:t>SUBMISSION &amp; ARTIST COMMITMENT</w:t>
+        <w:pStyle w:val="ListBullet"/>
+        <w:numPr>
+          <w:ilvl w:val="0"/>
+          <w:numId w:val="0"/>
+        </w:numPr>
+        <w:spacing w:after="80"/>
+        <w:rPr>
+          <w:color w:val="000000" w:themeColor="text1"/>
+        </w:rPr>
+      </w:pPr>
+      <w:r>
+        <w:rPr>
+          <w:color w:val="000000" w:themeColor="text1"/>
+        </w:rPr>
+        <w:t>*</w:t>
+      </w:r>
+      <w:r>
+        <w:rPr>
+          <w:color w:val="000000" w:themeColor="text1"/>
+        </w:rPr>
+        <w:t>Personal narrative / lived experience</w:t>
+      </w:r>
+      <w:r>
+        <w:rPr>
+          <w:color w:val="000000" w:themeColor="text1"/>
+        </w:rPr>
+        <w:t xml:space="preserve"> account</w:t>
+      </w:r>
+      <w:r>
+        <w:rPr>
+          <w:color w:val="000000" w:themeColor="text1"/>
+        </w:rPr>
+        <w:t xml:space="preserve"> - </w:t>
+      </w:r>
+      <w:r>
+        <w:t xml:space="preserve">a first-person account, reflection or story drawn from the artist's own experiences of fertility, subfertility, infertility or reproductive </w:t>
+      </w:r>
+      <w:r>
+        <w:t>health.</w:t>
+      </w:r>
+      <w:r>
+        <w:rPr>
+          <w:color w:val="000000" w:themeColor="text1"/>
+        </w:rPr>
+        <w:t xml:space="preserve"> This</w:t>
+      </w:r>
+      <w:r>
+        <w:rPr>
+          <w:color w:val="000000" w:themeColor="text1"/>
+        </w:rPr>
+        <w:t xml:space="preserve"> may take the form of memoir, creative non-fiction, personal essay, poetry or another written format.</w:t>
       </w:r>
     </w:p>
     <w:p>
       <w:pPr>
-        <w:pStyle w:val="Heading1"/>
-        <w:spacing w:before="0"/>
-        <w:rPr>
+        <w:rPr>
+          <w:b/>
+          <w:color w:val="000000" w:themeColor="text1"/>
+          <w:sz w:val="17"/>
+        </w:rPr>
+      </w:pPr>
+    </w:p>
+    <w:p>
+      <w:pPr>
+        <w:rPr>
+          <w:b/>
+          <w:color w:val="000000" w:themeColor="text1"/>
+          <w:sz w:val="17"/>
+        </w:rPr>
+      </w:pPr>
+      <w:r>
+        <w:rPr>
+          <w:b/>
+          <w:color w:val="000000" w:themeColor="text1"/>
+          <w:sz w:val="17"/>
+        </w:rPr>
+        <w:t>SELECTION PROCESS</w:t>
+      </w:r>
+    </w:p>
+    <w:p>
+      <w:pPr>
+        <w:rPr>
+          <w:b/>
+          <w:bCs/>
+          <w:color w:val="000000" w:themeColor="text1"/>
+        </w:rPr>
+      </w:pPr>
+      <w:r>
+        <w:rPr>
+          <w:b/>
+          <w:bCs/>
           <w:color w:val="000000" w:themeColor="text1"/>
           <w:sz w:val="24"/>
           <w:szCs w:val="24"/>
         </w:rPr>
-      </w:pPr>
-      <w:r>
-        <w:rPr>
-          <w:color w:val="000000" w:themeColor="text1"/>
-          <w:sz w:val="24"/>
-          <w:szCs w:val="24"/>
-        </w:rPr>
-        <w:t>What selected artists need to commit to</w:t>
-      </w:r>
-      <w:r>
-        <w:rPr>
-          <w:color w:val="000000" w:themeColor="text1"/>
-          <w:sz w:val="24"/>
-          <w:szCs w:val="24"/>
-        </w:rPr>
-        <w:t>:</w:t>
+        <w:t>How works will be selected.</w:t>
       </w:r>
     </w:p>
     <w:p>
@@ -905,7 +832,19 @@
         <w:rPr>
           <w:color w:val="000000" w:themeColor="text1"/>
         </w:rPr>
-        <w:t>Artists must be able to deliver and deinstall their work in person.</w:t>
+        <w:t xml:space="preserve">A </w:t>
+      </w:r>
+      <w:r>
+        <w:rPr>
+          <w:color w:val="000000" w:themeColor="text1"/>
+        </w:rPr>
+        <w:t>five-member selection committee</w:t>
+      </w:r>
+      <w:r>
+        <w:rPr>
+          <w:color w:val="000000" w:themeColor="text1"/>
+        </w:rPr>
+        <w:t xml:space="preserve"> will select the works for the exhibition.</w:t>
       </w:r>
     </w:p>
     <w:p>
@@ -920,7 +859,21 @@
         <w:rPr>
           <w:color w:val="000000" w:themeColor="text1"/>
         </w:rPr>
-        <w:t>Work must be delivered to Oaklands Social on Saturday 14 November, from 10am to 2pm.</w:t>
+        <w:t xml:space="preserve">The committee will comprise </w:t>
+      </w:r>
+      <w:proofErr w:type="spellStart"/>
+      <w:r>
+        <w:rPr>
+          <w:color w:val="000000" w:themeColor="text1"/>
+        </w:rPr>
+        <w:t>practising</w:t>
+      </w:r>
+      <w:proofErr w:type="spellEnd"/>
+      <w:r>
+        <w:rPr>
+          <w:color w:val="000000" w:themeColor="text1"/>
+        </w:rPr>
+        <w:t xml:space="preserve"> artists, gallery staff and individuals with lived experience of subfertility.</w:t>
       </w:r>
     </w:p>
     <w:p>
@@ -935,393 +888,23 @@
         <w:rPr>
           <w:color w:val="000000" w:themeColor="text1"/>
         </w:rPr>
-        <w:t>You will be asked to help with 1 to 2 half-days of invigilation from 10am to 2pm.</w:t>
+        <w:t>The committee brings together artistic, curatorial and lived</w:t>
+      </w:r>
+      <w:r>
+        <w:rPr>
+          <w:color w:val="000000" w:themeColor="text1"/>
+        </w:rPr>
+        <w:t xml:space="preserve"> </w:t>
+      </w:r>
+      <w:r>
+        <w:rPr>
+          <w:color w:val="000000" w:themeColor="text1"/>
+        </w:rPr>
+        <w:t>experience perspectives.</w:t>
       </w:r>
     </w:p>
     <w:p>
       <w:pPr>
-        <w:rPr>
-          <w:b/>
-          <w:color w:val="000000" w:themeColor="text1"/>
-          <w:sz w:val="17"/>
-        </w:rPr>
-      </w:pPr>
-    </w:p>
-    <w:p>
-      <w:pPr>
-        <w:rPr>
-          <w:color w:val="000000" w:themeColor="text1"/>
-        </w:rPr>
-      </w:pPr>
-      <w:r>
-        <w:rPr>
-          <w:b/>
-          <w:color w:val="000000" w:themeColor="text1"/>
-          <w:sz w:val="17"/>
-        </w:rPr>
-        <w:t>KEY DATES</w:t>
-      </w:r>
-    </w:p>
-    <w:p>
-      <w:pPr>
-        <w:pStyle w:val="Heading1"/>
-        <w:spacing w:before="0"/>
-        <w:rPr>
-          <w:color w:val="000000" w:themeColor="text1"/>
-          <w:sz w:val="24"/>
-          <w:szCs w:val="24"/>
-        </w:rPr>
-      </w:pPr>
-      <w:r>
-        <w:rPr>
-          <w:color w:val="000000" w:themeColor="text1"/>
-          <w:sz w:val="24"/>
-          <w:szCs w:val="24"/>
-        </w:rPr>
-        <w:t>Submission and exhibition timeline.</w:t>
-      </w:r>
-    </w:p>
-    <w:p>
-      <w:pPr>
-        <w:pStyle w:val="ListParagraph"/>
-        <w:numPr>
-          <w:ilvl w:val="0"/>
-          <w:numId w:val="14"/>
-        </w:numPr>
-        <w:rPr>
-          <w:color w:val="000000" w:themeColor="text1"/>
-        </w:rPr>
-      </w:pPr>
-      <w:r>
-        <w:rPr>
-          <w:b/>
-          <w:color w:val="000000" w:themeColor="text1"/>
-        </w:rPr>
-        <w:t xml:space="preserve">Submission </w:t>
-      </w:r>
-      <w:proofErr w:type="gramStart"/>
-      <w:r>
-        <w:rPr>
-          <w:b/>
-          <w:color w:val="000000" w:themeColor="text1"/>
-        </w:rPr>
-        <w:t xml:space="preserve">deadline  </w:t>
-      </w:r>
-      <w:r>
-        <w:rPr>
-          <w:color w:val="000000" w:themeColor="text1"/>
-        </w:rPr>
-        <w:t>Friday</w:t>
-      </w:r>
-      <w:proofErr w:type="gramEnd"/>
-      <w:r>
-        <w:rPr>
-          <w:color w:val="000000" w:themeColor="text1"/>
-        </w:rPr>
-        <w:t xml:space="preserve"> 2 October</w:t>
-      </w:r>
-    </w:p>
-    <w:p>
-      <w:pPr>
-        <w:pStyle w:val="ListParagraph"/>
-        <w:numPr>
-          <w:ilvl w:val="0"/>
-          <w:numId w:val="14"/>
-        </w:numPr>
-        <w:rPr>
-          <w:color w:val="000000" w:themeColor="text1"/>
-        </w:rPr>
-      </w:pPr>
-      <w:r>
-        <w:rPr>
-          <w:b/>
-          <w:color w:val="000000" w:themeColor="text1"/>
-        </w:rPr>
-        <w:t xml:space="preserve">Notification of </w:t>
-      </w:r>
-      <w:proofErr w:type="gramStart"/>
-      <w:r>
-        <w:rPr>
-          <w:b/>
-          <w:color w:val="000000" w:themeColor="text1"/>
-        </w:rPr>
-        <w:t xml:space="preserve">selection  </w:t>
-      </w:r>
-      <w:r>
-        <w:rPr>
-          <w:color w:val="000000" w:themeColor="text1"/>
-        </w:rPr>
-        <w:t>Sunday</w:t>
-      </w:r>
-      <w:proofErr w:type="gramEnd"/>
-      <w:r>
-        <w:rPr>
-          <w:color w:val="000000" w:themeColor="text1"/>
-        </w:rPr>
-        <w:t xml:space="preserve"> 18 October</w:t>
-      </w:r>
-    </w:p>
-    <w:p>
-      <w:pPr>
-        <w:pStyle w:val="ListParagraph"/>
-        <w:numPr>
-          <w:ilvl w:val="0"/>
-          <w:numId w:val="14"/>
-        </w:numPr>
-        <w:rPr>
-          <w:color w:val="000000" w:themeColor="text1"/>
-        </w:rPr>
-      </w:pPr>
-      <w:r>
-        <w:rPr>
-          <w:b/>
-          <w:color w:val="000000" w:themeColor="text1"/>
-        </w:rPr>
-        <w:t xml:space="preserve">Delivery of </w:t>
-      </w:r>
-      <w:proofErr w:type="gramStart"/>
-      <w:r>
-        <w:rPr>
-          <w:b/>
-          <w:color w:val="000000" w:themeColor="text1"/>
-        </w:rPr>
-        <w:t xml:space="preserve">work  </w:t>
-      </w:r>
-      <w:r>
-        <w:rPr>
-          <w:color w:val="000000" w:themeColor="text1"/>
-        </w:rPr>
-        <w:t>Saturday</w:t>
-      </w:r>
-      <w:proofErr w:type="gramEnd"/>
-      <w:r>
-        <w:rPr>
-          <w:color w:val="000000" w:themeColor="text1"/>
-        </w:rPr>
-        <w:t xml:space="preserve"> 14 November, 10am–2pm</w:t>
-      </w:r>
-    </w:p>
-    <w:p>
-      <w:pPr>
-        <w:pStyle w:val="ListParagraph"/>
-        <w:numPr>
-          <w:ilvl w:val="0"/>
-          <w:numId w:val="14"/>
-        </w:numPr>
-        <w:rPr>
-          <w:color w:val="000000" w:themeColor="text1"/>
-        </w:rPr>
-      </w:pPr>
-      <w:r>
-        <w:rPr>
-          <w:b/>
-          <w:color w:val="000000" w:themeColor="text1"/>
-        </w:rPr>
-        <w:t xml:space="preserve">Install </w:t>
-      </w:r>
-      <w:proofErr w:type="gramStart"/>
-      <w:r>
-        <w:rPr>
-          <w:b/>
-          <w:color w:val="000000" w:themeColor="text1"/>
-        </w:rPr>
-        <w:t xml:space="preserve">date  </w:t>
-      </w:r>
-      <w:r>
-        <w:rPr>
-          <w:color w:val="000000" w:themeColor="text1"/>
-        </w:rPr>
-        <w:t>Sunday</w:t>
-      </w:r>
-      <w:proofErr w:type="gramEnd"/>
-      <w:r>
-        <w:rPr>
-          <w:color w:val="000000" w:themeColor="text1"/>
-        </w:rPr>
-        <w:t xml:space="preserve"> 15 November</w:t>
-      </w:r>
-    </w:p>
-    <w:p>
-      <w:pPr>
-        <w:pStyle w:val="ListParagraph"/>
-        <w:numPr>
-          <w:ilvl w:val="0"/>
-          <w:numId w:val="14"/>
-        </w:numPr>
-        <w:rPr>
-          <w:color w:val="000000" w:themeColor="text1"/>
-        </w:rPr>
-      </w:pPr>
-      <w:proofErr w:type="gramStart"/>
-      <w:r>
-        <w:rPr>
-          <w:b/>
-          <w:color w:val="000000" w:themeColor="text1"/>
-        </w:rPr>
-        <w:t xml:space="preserve">Exhibition  </w:t>
-      </w:r>
-      <w:r>
-        <w:rPr>
-          <w:color w:val="000000" w:themeColor="text1"/>
-        </w:rPr>
-        <w:t>Monday</w:t>
-      </w:r>
-      <w:proofErr w:type="gramEnd"/>
-      <w:r>
-        <w:rPr>
-          <w:color w:val="000000" w:themeColor="text1"/>
-        </w:rPr>
-        <w:t xml:space="preserve"> 16 November – Saturday 28 November</w:t>
-      </w:r>
-    </w:p>
-    <w:p>
-      <w:pPr>
-        <w:pStyle w:val="ListParagraph"/>
-        <w:numPr>
-          <w:ilvl w:val="0"/>
-          <w:numId w:val="14"/>
-        </w:numPr>
-        <w:rPr>
-          <w:color w:val="000000" w:themeColor="text1"/>
-        </w:rPr>
-      </w:pPr>
-      <w:r>
-        <w:rPr>
-          <w:b/>
-          <w:color w:val="000000" w:themeColor="text1"/>
-        </w:rPr>
-        <w:t xml:space="preserve">Private </w:t>
-      </w:r>
-      <w:proofErr w:type="gramStart"/>
-      <w:r>
-        <w:rPr>
-          <w:b/>
-          <w:color w:val="000000" w:themeColor="text1"/>
-        </w:rPr>
-        <w:t xml:space="preserve">view  </w:t>
-      </w:r>
-      <w:r>
-        <w:rPr>
-          <w:color w:val="000000" w:themeColor="text1"/>
-        </w:rPr>
-        <w:t>Thursday</w:t>
-      </w:r>
-      <w:proofErr w:type="gramEnd"/>
-      <w:r>
-        <w:rPr>
-          <w:color w:val="000000" w:themeColor="text1"/>
-        </w:rPr>
-        <w:t xml:space="preserve"> 19 November</w:t>
-      </w:r>
-    </w:p>
-    <w:p>
-      <w:pPr>
-        <w:pStyle w:val="ListParagraph"/>
-        <w:numPr>
-          <w:ilvl w:val="0"/>
-          <w:numId w:val="14"/>
-        </w:numPr>
-        <w:rPr>
-          <w:color w:val="000000" w:themeColor="text1"/>
-        </w:rPr>
-      </w:pPr>
-      <w:r>
-        <w:rPr>
-          <w:b/>
-          <w:color w:val="000000" w:themeColor="text1"/>
-        </w:rPr>
-        <w:t xml:space="preserve">Take down and collection of </w:t>
-      </w:r>
-      <w:proofErr w:type="gramStart"/>
-      <w:r>
-        <w:rPr>
-          <w:b/>
-          <w:color w:val="000000" w:themeColor="text1"/>
-        </w:rPr>
-        <w:t xml:space="preserve">work  </w:t>
-      </w:r>
-      <w:r>
-        <w:rPr>
-          <w:color w:val="000000" w:themeColor="text1"/>
-        </w:rPr>
-        <w:t>Sunday</w:t>
-      </w:r>
-      <w:proofErr w:type="gramEnd"/>
-      <w:r>
-        <w:rPr>
-          <w:color w:val="000000" w:themeColor="text1"/>
-        </w:rPr>
-        <w:t xml:space="preserve"> 29 November</w:t>
-      </w:r>
-    </w:p>
-    <w:p>
-      <w:pPr>
-        <w:rPr>
-          <w:b/>
-          <w:color w:val="000000" w:themeColor="text1"/>
-          <w:sz w:val="17"/>
-        </w:rPr>
-      </w:pPr>
-    </w:p>
-    <w:p>
-      <w:pPr>
-        <w:rPr>
-          <w:b/>
-          <w:color w:val="000000" w:themeColor="text1"/>
-          <w:sz w:val="17"/>
-        </w:rPr>
-      </w:pPr>
-    </w:p>
-    <w:p>
-      <w:pPr>
-        <w:rPr>
-          <w:color w:val="000000" w:themeColor="text1"/>
-        </w:rPr>
-      </w:pPr>
-      <w:r>
-        <w:rPr>
-          <w:b/>
-          <w:color w:val="000000" w:themeColor="text1"/>
-          <w:sz w:val="17"/>
-        </w:rPr>
-        <w:lastRenderedPageBreak/>
-        <w:t>VENUE</w:t>
-      </w:r>
-    </w:p>
-    <w:p>
-      <w:pPr>
-        <w:pStyle w:val="Heading1"/>
-        <w:rPr>
-          <w:color w:val="000000" w:themeColor="text1"/>
-          <w:sz w:val="24"/>
-          <w:szCs w:val="24"/>
-        </w:rPr>
-      </w:pPr>
-      <w:r>
-        <w:rPr>
-          <w:color w:val="000000" w:themeColor="text1"/>
-          <w:sz w:val="24"/>
-          <w:szCs w:val="24"/>
-        </w:rPr>
-        <w:t>Oaklands Social – Bow Arts</w:t>
-      </w:r>
-    </w:p>
-    <w:p>
-      <w:pPr>
-        <w:rPr>
-          <w:color w:val="000000" w:themeColor="text1"/>
-        </w:rPr>
-      </w:pPr>
-      <w:r>
-        <w:rPr>
-          <w:b/>
-          <w:color w:val="000000" w:themeColor="text1"/>
-        </w:rPr>
-        <w:t>Oaklands Social, Oaklands House, Old Oak Common Lane, London, NW10 6DU</w:t>
-      </w:r>
-    </w:p>
-    <w:p>
-      <w:pPr>
         <w:pStyle w:val="ListBullet"/>
         <w:spacing w:after="80"/>
         <w:rPr>
@@ -1329,55 +912,18 @@
         </w:rPr>
       </w:pPr>
       <w:r>
-        <w:rPr>
-          <w:color w:val="000000" w:themeColor="text1"/>
-        </w:rPr>
-        <w:t>Nearest station(s): North Acton (Underground), Willesden Junction (Overground/Underground)</w:t>
-      </w:r>
-    </w:p>
-    <w:p>
-      <w:pPr>
-        <w:pStyle w:val="ListBullet"/>
-        <w:spacing w:after="80"/>
-        <w:rPr>
-          <w:color w:val="000000" w:themeColor="text1"/>
-        </w:rPr>
-      </w:pPr>
-      <w:r>
-        <w:rPr>
-          <w:color w:val="000000" w:themeColor="text1"/>
-        </w:rPr>
-        <w:t>Bus: 260, 266, 440, 487, BL-1, BL-2</w:t>
-      </w:r>
-    </w:p>
-    <w:p>
-      <w:pPr>
-        <w:pStyle w:val="ListBullet"/>
-        <w:spacing w:after="80"/>
-        <w:rPr>
-          <w:color w:val="000000" w:themeColor="text1"/>
-        </w:rPr>
-      </w:pPr>
-      <w:r>
-        <w:rPr>
-          <w:color w:val="000000" w:themeColor="text1"/>
-        </w:rPr>
-        <w:t>Parking: No Parking</w:t>
-      </w:r>
-    </w:p>
-    <w:p>
-      <w:pPr>
-        <w:pStyle w:val="ListBullet"/>
-        <w:spacing w:after="80"/>
-        <w:rPr>
-          <w:color w:val="000000" w:themeColor="text1"/>
-        </w:rPr>
-      </w:pPr>
-      <w:r>
-        <w:rPr>
-          <w:color w:val="000000" w:themeColor="text1"/>
-        </w:rPr>
-        <w:t>Bike: Yes</w:t>
+        <w:t xml:space="preserve">The selection process will be conducted on a blind basis, with identifying information removed from submissions </w:t>
+      </w:r>
+      <w:proofErr w:type="gramStart"/>
+      <w:r>
+        <w:t>where</w:t>
+      </w:r>
+      <w:proofErr w:type="gramEnd"/>
+      <w:r>
+        <w:t xml:space="preserve"> reasonably practicable</w:t>
+      </w:r>
+      <w:r>
+        <w:t>.</w:t>
       </w:r>
     </w:p>
     <w:p>
@@ -1396,12 +942,603 @@
     </w:p>
     <w:p>
       <w:pPr>
+        <w:rPr>
+          <w:color w:val="000000" w:themeColor="text1"/>
+        </w:rPr>
+      </w:pPr>
+      <w:r>
+        <w:rPr>
+          <w:b/>
+          <w:color w:val="000000" w:themeColor="text1"/>
+          <w:sz w:val="17"/>
+        </w:rPr>
+        <w:t>SUBMISSION &amp; ARTIST COMMITMENT</w:t>
+      </w:r>
+    </w:p>
+    <w:p>
+      <w:pPr>
+        <w:pStyle w:val="Heading1"/>
+        <w:spacing w:before="0"/>
+        <w:rPr>
+          <w:color w:val="000000" w:themeColor="text1"/>
+          <w:sz w:val="24"/>
+          <w:szCs w:val="24"/>
+        </w:rPr>
+      </w:pPr>
+      <w:r>
+        <w:rPr>
+          <w:color w:val="000000" w:themeColor="text1"/>
+          <w:sz w:val="24"/>
+          <w:szCs w:val="24"/>
+        </w:rPr>
+        <w:t>What selected artists need to commit to</w:t>
+      </w:r>
+      <w:r>
+        <w:rPr>
+          <w:color w:val="000000" w:themeColor="text1"/>
+          <w:sz w:val="24"/>
+          <w:szCs w:val="24"/>
+        </w:rPr>
+        <w:t>:</w:t>
+      </w:r>
+    </w:p>
+    <w:p>
+      <w:pPr>
+        <w:pStyle w:val="ListBullet"/>
+        <w:spacing w:after="80"/>
+        <w:rPr>
+          <w:color w:val="000000" w:themeColor="text1"/>
+        </w:rPr>
+      </w:pPr>
+      <w:r>
+        <w:t xml:space="preserve">Selected artists must be able to deliver and </w:t>
+      </w:r>
+      <w:r>
+        <w:t xml:space="preserve">collect </w:t>
+      </w:r>
+      <w:r>
+        <w:t>their work in person</w:t>
+      </w:r>
+      <w:r>
+        <w:t>.</w:t>
+      </w:r>
+    </w:p>
+    <w:p>
+      <w:pPr>
+        <w:pStyle w:val="ListBullet"/>
+        <w:spacing w:after="80"/>
+        <w:rPr>
+          <w:color w:val="000000" w:themeColor="text1"/>
+        </w:rPr>
+      </w:pPr>
+      <w:r>
+        <w:rPr>
+          <w:color w:val="000000" w:themeColor="text1"/>
+        </w:rPr>
+        <w:t xml:space="preserve">Work must be delivered to Oaklands Social on Saturday </w:t>
+      </w:r>
+      <w:r>
+        <w:rPr>
+          <w:color w:val="000000" w:themeColor="text1"/>
+          <w:highlight w:val="yellow"/>
+        </w:rPr>
+        <w:t>14 November</w:t>
+      </w:r>
+      <w:r>
+        <w:rPr>
+          <w:color w:val="000000" w:themeColor="text1"/>
+        </w:rPr>
+        <w:t>, from 10am to 2pm.</w:t>
+      </w:r>
+    </w:p>
+    <w:p>
+      <w:pPr>
+        <w:pStyle w:val="ListBullet"/>
+        <w:spacing w:after="80"/>
+        <w:rPr>
+          <w:color w:val="000000" w:themeColor="text1"/>
+        </w:rPr>
+      </w:pPr>
+      <w:r>
+        <w:rPr>
+          <w:color w:val="000000" w:themeColor="text1"/>
+        </w:rPr>
+        <w:t>Selected artists</w:t>
+      </w:r>
+      <w:r>
+        <w:rPr>
+          <w:color w:val="000000" w:themeColor="text1"/>
+        </w:rPr>
+        <w:t xml:space="preserve"> will be asked to help with 1</w:t>
+      </w:r>
+      <w:r>
+        <w:rPr>
+          <w:color w:val="000000" w:themeColor="text1"/>
+        </w:rPr>
+        <w:softHyphen/>
+        <w:t>–</w:t>
+      </w:r>
+      <w:r>
+        <w:rPr>
+          <w:color w:val="000000" w:themeColor="text1"/>
+        </w:rPr>
+        <w:t>2 half-days of invigilation from 10am to 2pm.</w:t>
+      </w:r>
+    </w:p>
+    <w:p>
+      <w:pPr>
+        <w:rPr>
+          <w:b/>
+          <w:color w:val="000000" w:themeColor="text1"/>
+          <w:sz w:val="17"/>
+        </w:rPr>
+      </w:pPr>
+    </w:p>
+    <w:p>
+      <w:pPr>
+        <w:rPr>
+          <w:color w:val="000000" w:themeColor="text1"/>
+        </w:rPr>
+      </w:pPr>
+      <w:r>
+        <w:rPr>
+          <w:b/>
+          <w:color w:val="000000" w:themeColor="text1"/>
+          <w:sz w:val="17"/>
+        </w:rPr>
+        <w:t>KEY DATES</w:t>
+      </w:r>
+    </w:p>
+    <w:p>
+      <w:pPr>
+        <w:pStyle w:val="Heading1"/>
+        <w:spacing w:before="0"/>
+        <w:rPr>
+          <w:color w:val="000000" w:themeColor="text1"/>
+          <w:sz w:val="24"/>
+          <w:szCs w:val="24"/>
+        </w:rPr>
+      </w:pPr>
+      <w:r>
+        <w:rPr>
+          <w:color w:val="000000" w:themeColor="text1"/>
+          <w:sz w:val="24"/>
+          <w:szCs w:val="24"/>
+        </w:rPr>
+        <w:t>Submission and exhibition timeline.</w:t>
+      </w:r>
+    </w:p>
+    <w:p>
+      <w:pPr>
+        <w:pStyle w:val="ListParagraph"/>
+        <w:numPr>
+          <w:ilvl w:val="0"/>
+          <w:numId w:val="14"/>
+        </w:numPr>
+        <w:rPr>
+          <w:color w:val="000000" w:themeColor="text1"/>
+          <w:highlight w:val="yellow"/>
+        </w:rPr>
+      </w:pPr>
+      <w:r>
+        <w:rPr>
+          <w:b/>
+          <w:color w:val="000000" w:themeColor="text1"/>
+          <w:highlight w:val="yellow"/>
+        </w:rPr>
+        <w:t xml:space="preserve">Submission </w:t>
+      </w:r>
+      <w:proofErr w:type="gramStart"/>
+      <w:r>
+        <w:rPr>
+          <w:b/>
+          <w:color w:val="000000" w:themeColor="text1"/>
+          <w:highlight w:val="yellow"/>
+        </w:rPr>
+        <w:t xml:space="preserve">deadline  </w:t>
+      </w:r>
+      <w:r>
+        <w:rPr>
+          <w:highlight w:val="yellow"/>
+        </w:rPr>
+        <w:t>Friday</w:t>
+      </w:r>
+      <w:proofErr w:type="gramEnd"/>
+      <w:r>
+        <w:rPr>
+          <w:highlight w:val="yellow"/>
+        </w:rPr>
+        <w:t xml:space="preserve"> 9 October 2026, 23:59</w:t>
+      </w:r>
+    </w:p>
+    <w:p>
+      <w:pPr>
+        <w:pStyle w:val="ListParagraph"/>
+        <w:numPr>
+          <w:ilvl w:val="0"/>
+          <w:numId w:val="14"/>
+        </w:numPr>
+        <w:rPr>
+          <w:color w:val="000000" w:themeColor="text1"/>
+          <w:highlight w:val="yellow"/>
+        </w:rPr>
+      </w:pPr>
+      <w:r>
+        <w:rPr>
+          <w:b/>
+          <w:color w:val="000000" w:themeColor="text1"/>
+          <w:highlight w:val="yellow"/>
+        </w:rPr>
+        <w:t xml:space="preserve">Notification of </w:t>
+      </w:r>
+      <w:proofErr w:type="gramStart"/>
+      <w:r>
+        <w:rPr>
+          <w:b/>
+          <w:color w:val="000000" w:themeColor="text1"/>
+          <w:highlight w:val="yellow"/>
+        </w:rPr>
+        <w:t xml:space="preserve">selection  </w:t>
+      </w:r>
+      <w:r>
+        <w:rPr>
+          <w:color w:val="000000" w:themeColor="text1"/>
+          <w:highlight w:val="yellow"/>
+        </w:rPr>
+        <w:t>Sunday</w:t>
+      </w:r>
+      <w:proofErr w:type="gramEnd"/>
+      <w:r>
+        <w:rPr>
+          <w:color w:val="000000" w:themeColor="text1"/>
+          <w:highlight w:val="yellow"/>
+        </w:rPr>
+        <w:t xml:space="preserve"> 18 October</w:t>
+      </w:r>
+    </w:p>
+    <w:p>
+      <w:pPr>
+        <w:pStyle w:val="ListParagraph"/>
+        <w:numPr>
+          <w:ilvl w:val="0"/>
+          <w:numId w:val="14"/>
+        </w:numPr>
+        <w:rPr>
+          <w:color w:val="000000" w:themeColor="text1"/>
+          <w:highlight w:val="yellow"/>
+        </w:rPr>
+      </w:pPr>
+      <w:r>
+        <w:rPr>
+          <w:b/>
+          <w:color w:val="000000" w:themeColor="text1"/>
+          <w:highlight w:val="yellow"/>
+        </w:rPr>
+        <w:t xml:space="preserve">Delivery of </w:t>
+      </w:r>
+      <w:proofErr w:type="gramStart"/>
+      <w:r>
+        <w:rPr>
+          <w:b/>
+          <w:color w:val="000000" w:themeColor="text1"/>
+          <w:highlight w:val="yellow"/>
+        </w:rPr>
+        <w:t xml:space="preserve">work  </w:t>
+      </w:r>
+      <w:r>
+        <w:rPr>
+          <w:color w:val="000000" w:themeColor="text1"/>
+          <w:highlight w:val="yellow"/>
+        </w:rPr>
+        <w:t>Saturday</w:t>
+      </w:r>
+      <w:proofErr w:type="gramEnd"/>
+      <w:r>
+        <w:rPr>
+          <w:color w:val="000000" w:themeColor="text1"/>
+          <w:highlight w:val="yellow"/>
+        </w:rPr>
+        <w:t xml:space="preserve"> 14 November, 10am–2pm</w:t>
+      </w:r>
+    </w:p>
+    <w:p>
+      <w:pPr>
+        <w:pStyle w:val="ListParagraph"/>
+        <w:numPr>
+          <w:ilvl w:val="0"/>
+          <w:numId w:val="14"/>
+        </w:numPr>
+        <w:rPr>
+          <w:color w:val="000000" w:themeColor="text1"/>
+          <w:highlight w:val="yellow"/>
+        </w:rPr>
+      </w:pPr>
+      <w:r>
+        <w:rPr>
+          <w:b/>
+          <w:color w:val="000000" w:themeColor="text1"/>
+          <w:highlight w:val="yellow"/>
+        </w:rPr>
+        <w:t xml:space="preserve">Install </w:t>
+      </w:r>
+      <w:proofErr w:type="gramStart"/>
+      <w:r>
+        <w:rPr>
+          <w:b/>
+          <w:color w:val="000000" w:themeColor="text1"/>
+          <w:highlight w:val="yellow"/>
+        </w:rPr>
+        <w:t xml:space="preserve">date  </w:t>
+      </w:r>
+      <w:r>
+        <w:rPr>
+          <w:color w:val="000000" w:themeColor="text1"/>
+          <w:highlight w:val="yellow"/>
+        </w:rPr>
+        <w:t>Sunday</w:t>
+      </w:r>
+      <w:proofErr w:type="gramEnd"/>
+      <w:r>
+        <w:rPr>
+          <w:color w:val="000000" w:themeColor="text1"/>
+          <w:highlight w:val="yellow"/>
+        </w:rPr>
+        <w:t xml:space="preserve"> 15 November</w:t>
+      </w:r>
+    </w:p>
+    <w:p>
+      <w:pPr>
+        <w:pStyle w:val="ListParagraph"/>
+        <w:numPr>
+          <w:ilvl w:val="0"/>
+          <w:numId w:val="14"/>
+        </w:numPr>
+        <w:rPr>
+          <w:color w:val="000000" w:themeColor="text1"/>
+          <w:highlight w:val="yellow"/>
+        </w:rPr>
+      </w:pPr>
+      <w:proofErr w:type="gramStart"/>
+      <w:r>
+        <w:rPr>
+          <w:b/>
+          <w:color w:val="000000" w:themeColor="text1"/>
+          <w:highlight w:val="yellow"/>
+        </w:rPr>
+        <w:lastRenderedPageBreak/>
+        <w:t xml:space="preserve">Exhibition  </w:t>
+      </w:r>
+      <w:r>
+        <w:rPr>
+          <w:color w:val="000000" w:themeColor="text1"/>
+          <w:highlight w:val="yellow"/>
+        </w:rPr>
+        <w:t>Monday</w:t>
+      </w:r>
+      <w:proofErr w:type="gramEnd"/>
+      <w:r>
+        <w:rPr>
+          <w:color w:val="000000" w:themeColor="text1"/>
+          <w:highlight w:val="yellow"/>
+        </w:rPr>
+        <w:t xml:space="preserve"> 16 November – Saturday 28 November</w:t>
+      </w:r>
+    </w:p>
+    <w:p>
+      <w:pPr>
+        <w:pStyle w:val="ListParagraph"/>
+        <w:numPr>
+          <w:ilvl w:val="0"/>
+          <w:numId w:val="14"/>
+        </w:numPr>
+        <w:rPr>
+          <w:color w:val="000000" w:themeColor="text1"/>
+          <w:highlight w:val="yellow"/>
+        </w:rPr>
+      </w:pPr>
+      <w:r>
+        <w:rPr>
+          <w:b/>
+          <w:color w:val="000000" w:themeColor="text1"/>
+          <w:highlight w:val="yellow"/>
+        </w:rPr>
+        <w:t xml:space="preserve">Private </w:t>
+      </w:r>
+      <w:proofErr w:type="gramStart"/>
+      <w:r>
+        <w:rPr>
+          <w:b/>
+          <w:color w:val="000000" w:themeColor="text1"/>
+          <w:highlight w:val="yellow"/>
+        </w:rPr>
+        <w:t xml:space="preserve">view  </w:t>
+      </w:r>
+      <w:r>
+        <w:rPr>
+          <w:color w:val="000000" w:themeColor="text1"/>
+          <w:highlight w:val="yellow"/>
+        </w:rPr>
+        <w:t>Thursday</w:t>
+      </w:r>
+      <w:proofErr w:type="gramEnd"/>
+      <w:r>
+        <w:rPr>
+          <w:color w:val="000000" w:themeColor="text1"/>
+          <w:highlight w:val="yellow"/>
+        </w:rPr>
+        <w:t xml:space="preserve"> 19 November</w:t>
+      </w:r>
+    </w:p>
+    <w:p>
+      <w:pPr>
+        <w:pStyle w:val="ListParagraph"/>
+        <w:numPr>
+          <w:ilvl w:val="0"/>
+          <w:numId w:val="14"/>
+        </w:numPr>
+        <w:rPr>
+          <w:color w:val="000000" w:themeColor="text1"/>
+        </w:rPr>
+      </w:pPr>
+      <w:r>
+        <w:rPr>
+          <w:b/>
+          <w:color w:val="000000" w:themeColor="text1"/>
+          <w:highlight w:val="yellow"/>
+        </w:rPr>
+        <w:t xml:space="preserve">Take down and collection of </w:t>
+      </w:r>
+      <w:proofErr w:type="gramStart"/>
+      <w:r>
+        <w:rPr>
+          <w:b/>
+          <w:color w:val="000000" w:themeColor="text1"/>
+          <w:highlight w:val="yellow"/>
+        </w:rPr>
+        <w:t xml:space="preserve">work  </w:t>
+      </w:r>
+      <w:r>
+        <w:rPr>
+          <w:color w:val="000000" w:themeColor="text1"/>
+          <w:highlight w:val="yellow"/>
+        </w:rPr>
+        <w:t>Sunday</w:t>
+      </w:r>
+      <w:proofErr w:type="gramEnd"/>
+      <w:r>
+        <w:rPr>
+          <w:color w:val="000000" w:themeColor="text1"/>
+          <w:highlight w:val="yellow"/>
+        </w:rPr>
+        <w:t xml:space="preserve"> 29 November</w:t>
+      </w:r>
+    </w:p>
+    <w:p>
+      <w:pPr>
+        <w:rPr>
+          <w:b/>
+          <w:color w:val="000000" w:themeColor="text1"/>
+          <w:sz w:val="17"/>
+        </w:rPr>
+      </w:pPr>
+    </w:p>
+    <w:p>
+      <w:pPr>
+        <w:rPr>
+          <w:color w:val="000000" w:themeColor="text1"/>
+        </w:rPr>
+      </w:pPr>
+      <w:r>
+        <w:rPr>
+          <w:b/>
+          <w:color w:val="000000" w:themeColor="text1"/>
+          <w:sz w:val="17"/>
+        </w:rPr>
+        <w:t>VENUE</w:t>
+      </w:r>
+    </w:p>
+    <w:p>
+      <w:pPr>
+        <w:pStyle w:val="Heading1"/>
+        <w:spacing w:before="0"/>
+        <w:rPr>
+          <w:color w:val="000000" w:themeColor="text1"/>
+          <w:sz w:val="24"/>
+          <w:szCs w:val="24"/>
+        </w:rPr>
+      </w:pPr>
+      <w:r>
+        <w:rPr>
+          <w:color w:val="000000" w:themeColor="text1"/>
+          <w:sz w:val="24"/>
+          <w:szCs w:val="24"/>
+        </w:rPr>
+        <w:t>Oaklands Social – Bow Arts</w:t>
+      </w:r>
+    </w:p>
+    <w:p>
+      <w:pPr>
+        <w:rPr>
+          <w:color w:val="000000" w:themeColor="text1"/>
+        </w:rPr>
+      </w:pPr>
+      <w:r>
+        <w:rPr>
+          <w:b/>
+          <w:color w:val="000000" w:themeColor="text1"/>
+        </w:rPr>
+        <w:t>Oaklands Social, Oaklands House, Old Oak Common Lane, London, NW10 6DU</w:t>
+      </w:r>
+    </w:p>
+    <w:p>
+      <w:pPr>
+        <w:pStyle w:val="ListBullet"/>
+        <w:spacing w:after="80"/>
+        <w:rPr>
+          <w:color w:val="000000" w:themeColor="text1"/>
+        </w:rPr>
+      </w:pPr>
+      <w:r>
+        <w:rPr>
+          <w:color w:val="000000" w:themeColor="text1"/>
+        </w:rPr>
+        <w:t>Nearest station(s): North Acton (Underground), Willesden Junction (Overground/Underground)</w:t>
+      </w:r>
+    </w:p>
+    <w:p>
+      <w:pPr>
+        <w:pStyle w:val="ListBullet"/>
+        <w:spacing w:after="80"/>
+        <w:rPr>
+          <w:color w:val="000000" w:themeColor="text1"/>
+        </w:rPr>
+      </w:pPr>
+      <w:r>
+        <w:rPr>
+          <w:color w:val="000000" w:themeColor="text1"/>
+        </w:rPr>
+        <w:t>Bus: 260, 266, 440, 487, BL-1, BL-2</w:t>
+      </w:r>
+    </w:p>
+    <w:p>
+      <w:pPr>
+        <w:pStyle w:val="ListBullet"/>
+        <w:spacing w:after="80"/>
+        <w:rPr>
+          <w:color w:val="000000" w:themeColor="text1"/>
+        </w:rPr>
+      </w:pPr>
+      <w:r>
+        <w:rPr>
+          <w:color w:val="000000" w:themeColor="text1"/>
+        </w:rPr>
+        <w:t>Parking: No Parking</w:t>
+      </w:r>
+    </w:p>
+    <w:p>
+      <w:pPr>
+        <w:pStyle w:val="ListBullet"/>
+        <w:spacing w:after="80"/>
+        <w:rPr>
+          <w:color w:val="000000" w:themeColor="text1"/>
+        </w:rPr>
+      </w:pPr>
+      <w:r>
+        <w:rPr>
+          <w:color w:val="000000" w:themeColor="text1"/>
+        </w:rPr>
+        <w:t>Bike: Yes</w:t>
+      </w:r>
+    </w:p>
+    <w:p>
+      <w:pPr>
         <w:pStyle w:val="ListBullet"/>
         <w:numPr>
           <w:ilvl w:val="0"/>
           <w:numId w:val="0"/>
         </w:numPr>
         <w:spacing w:after="80"/>
+        <w:ind w:left="360"/>
         <w:rPr>
           <w:color w:val="000000" w:themeColor="text1"/>
         </w:rPr>
@@ -1409,71 +1546,80 @@
     </w:p>
     <w:p>
       <w:pPr>
-        <w:pStyle w:val="ListBullet"/>
+        <w:jc w:val="center"/>
+        <w:rPr>
+          <w:b/>
+          <w:color w:val="000000" w:themeColor="text1"/>
+          <w:sz w:val="24"/>
+          <w:szCs w:val="24"/>
+        </w:rPr>
+      </w:pPr>
+      <w:r>
+        <w:rPr>
+          <w:b/>
+          <w:color w:val="000000" w:themeColor="text1"/>
+          <w:sz w:val="24"/>
+          <w:szCs w:val="24"/>
+        </w:rPr>
+        <w:t>TERMS &amp; CONDITIONS</w:t>
+      </w:r>
+    </w:p>
+    <w:p>
+      <w:pPr>
+        <w:pStyle w:val="Heading2"/>
+        <w:rPr>
+          <w:color w:val="000000" w:themeColor="text1"/>
+        </w:rPr>
+      </w:pPr>
+      <w:r>
+        <w:rPr>
+          <w:color w:val="000000" w:themeColor="text1"/>
+        </w:rPr>
+        <w:t>1. Eligibility</w:t>
+      </w:r>
+    </w:p>
+    <w:p>
+      <w:pPr>
+        <w:pStyle w:val="ListParagraph"/>
         <w:numPr>
           <w:ilvl w:val="0"/>
-          <w:numId w:val="0"/>
+          <w:numId w:val="19"/>
         </w:numPr>
-        <w:spacing w:after="80"/>
-        <w:jc w:val="center"/>
-        <w:rPr>
-          <w:color w:val="000000" w:themeColor="text1"/>
-        </w:rPr>
-      </w:pPr>
-      <w:r>
-        <w:rPr>
-          <w:b/>
-          <w:color w:val="000000" w:themeColor="text1"/>
-          <w:sz w:val="17"/>
-        </w:rPr>
-        <w:t>TERMS &amp; CONDITIONS</w:t>
+        <w:rPr>
+          <w:color w:val="000000" w:themeColor="text1"/>
+        </w:rPr>
+      </w:pPr>
+      <w:r>
+        <w:t>T</w:t>
+      </w:r>
+      <w:r>
+        <w:t xml:space="preserve">he open call is open to the applicant groups and perspectives described in these guidelines who are based in London, the </w:t>
+      </w:r>
+      <w:proofErr w:type="gramStart"/>
+      <w:r>
+        <w:t>South East</w:t>
+      </w:r>
+      <w:proofErr w:type="gramEnd"/>
+      <w:r>
+        <w:t xml:space="preserve"> and East of England.</w:t>
       </w:r>
     </w:p>
     <w:p>
       <w:pPr>
-        <w:pStyle w:val="Heading1"/>
-        <w:spacing w:before="0"/>
-        <w:jc w:val="center"/>
-        <w:rPr>
-          <w:color w:val="000000" w:themeColor="text1"/>
-          <w:sz w:val="24"/>
-          <w:szCs w:val="24"/>
-        </w:rPr>
-      </w:pPr>
-      <w:r>
-        <w:rPr>
-          <w:color w:val="000000" w:themeColor="text1"/>
-          <w:sz w:val="24"/>
-          <w:szCs w:val="24"/>
-        </w:rPr>
-        <w:t>Submission terms</w:t>
-      </w:r>
-    </w:p>
-    <w:p>
-      <w:pPr>
-        <w:pStyle w:val="Heading2"/>
-        <w:rPr>
-          <w:color w:val="000000" w:themeColor="text1"/>
-        </w:rPr>
-      </w:pPr>
-      <w:r>
-        <w:rPr>
-          <w:color w:val="000000" w:themeColor="text1"/>
-        </w:rPr>
-        <w:t>1. Eligibility</w:t>
-      </w:r>
-    </w:p>
-    <w:p>
-      <w:pPr>
-        <w:rPr>
-          <w:color w:val="000000" w:themeColor="text1"/>
-        </w:rPr>
-      </w:pPr>
-      <w:r>
-        <w:rPr>
-          <w:color w:val="000000" w:themeColor="text1"/>
-        </w:rPr>
-        <w:t>The open call welcomes the applicant groups and perspectives described in these guidelines. No previous exhibition experience is required.</w:t>
+        <w:pStyle w:val="ListParagraph"/>
+        <w:numPr>
+          <w:ilvl w:val="0"/>
+          <w:numId w:val="19"/>
+        </w:numPr>
+        <w:rPr>
+          <w:color w:val="000000" w:themeColor="text1"/>
+        </w:rPr>
+      </w:pPr>
+      <w:r>
+        <w:rPr>
+          <w:color w:val="000000" w:themeColor="text1"/>
+        </w:rPr>
+        <w:t>No previous exhibition experience is required.</w:t>
       </w:r>
     </w:p>
     <w:p>
@@ -1522,17 +1668,45 @@
           <w:numId w:val="17"/>
         </w:numPr>
         <w:rPr>
-          <w:color w:val="000000" w:themeColor="text1"/>
-        </w:rPr>
-      </w:pPr>
-      <w:r>
-        <w:rPr>
-          <w:rStyle w:val="Strong"/>
-        </w:rPr>
-        <w:t>Artists may submit a maximum of two artworks for consideration as part of this open call.</w:t>
-      </w:r>
-      <w:r>
-        <w:t xml:space="preserve"> </w:t>
+          <w:b/>
+          <w:bCs/>
+          <w:color w:val="000000" w:themeColor="text1"/>
+        </w:rPr>
+      </w:pPr>
+      <w:r>
+        <w:rPr>
+          <w:b/>
+          <w:bCs/>
+        </w:rPr>
+        <w:t xml:space="preserve">Artists may submit a maximum of two artworks, with </w:t>
+      </w:r>
+      <w:r>
+        <w:rPr>
+          <w:b/>
+          <w:bCs/>
+        </w:rPr>
+        <w:t>a maximum of</w:t>
+      </w:r>
+      <w:r>
+        <w:rPr>
+          <w:b/>
+          <w:bCs/>
+        </w:rPr>
+        <w:t xml:space="preserve"> five images </w:t>
+      </w:r>
+      <w:r>
+        <w:rPr>
+          <w:b/>
+          <w:bCs/>
+        </w:rPr>
+        <w:t>across both artworks.</w:t>
+      </w:r>
+      <w:r>
+        <w:rPr>
+          <w:b/>
+          <w:bCs/>
+        </w:rPr>
+        <w:t xml:space="preserve"> Each image must be no larger than 5 MB.</w:t>
       </w:r>
     </w:p>
     <w:p>
@@ -1542,6 +1716,62 @@
           <w:ilvl w:val="0"/>
           <w:numId w:val="17"/>
         </w:numPr>
+        <w:spacing w:after="0"/>
+        <w:rPr>
+          <w:color w:val="000000" w:themeColor="text1"/>
+          <w:lang w:val="en-GB"/>
+        </w:rPr>
+      </w:pPr>
+      <w:r>
+        <w:rPr>
+          <w:color w:val="000000" w:themeColor="text1"/>
+          <w:lang w:val="en-GB"/>
+        </w:rPr>
+        <w:t xml:space="preserve">Each file submitted must be named using the following format: </w:t>
+      </w:r>
+    </w:p>
+    <w:p>
+      <w:pPr>
+        <w:spacing w:after="0"/>
+        <w:ind w:left="720"/>
+        <w:rPr>
+          <w:b/>
+          <w:bCs/>
+          <w:color w:val="7F7F7F" w:themeColor="text1" w:themeTint="80"/>
+        </w:rPr>
+      </w:pPr>
+      <w:r>
+        <w:rPr>
+          <w:b/>
+          <w:bCs/>
+          <w:color w:val="7F7F7F" w:themeColor="text1" w:themeTint="80"/>
+        </w:rPr>
+        <w:t>NameSurname_TitleOfWork</w:t>
+      </w:r>
+      <w:r>
+        <w:rPr>
+          <w:b/>
+          <w:bCs/>
+          <w:color w:val="7F7F7F" w:themeColor="text1" w:themeTint="80"/>
+        </w:rPr>
+        <w:t>_Year</w:t>
+      </w:r>
+      <w:r>
+        <w:rPr>
+          <w:b/>
+          <w:bCs/>
+          <w:color w:val="7F7F7F" w:themeColor="text1" w:themeTint="80"/>
+        </w:rPr>
+        <w:t>.jpg</w:t>
+      </w:r>
+    </w:p>
+    <w:p>
+      <w:pPr>
+        <w:pStyle w:val="ListParagraph"/>
+        <w:numPr>
+          <w:ilvl w:val="0"/>
+          <w:numId w:val="17"/>
+        </w:numPr>
         <w:rPr>
           <w:color w:val="000000" w:themeColor="text1"/>
         </w:rPr>
@@ -1564,7 +1794,36 @@
         <w:rPr>
           <w:color w:val="000000" w:themeColor="text1"/>
         </w:rPr>
-        <w:t xml:space="preserve"> team where the nature of the artwork requires an alternative method of presentation. Artists should clearly state any specific framing, mounting or installation requirements in the application form under “Notes on artwork”.</w:t>
+        <w:t xml:space="preserve"> team where the nature of the artwork requires an alternative method of presentation. Artists should clearly state any specific framing, mounting or installation requirements in the application form.</w:t>
+      </w:r>
+    </w:p>
+    <w:p>
+      <w:pPr>
+        <w:pStyle w:val="ListParagraph"/>
+        <w:numPr>
+          <w:ilvl w:val="0"/>
+          <w:numId w:val="17"/>
+        </w:numPr>
+        <w:rPr>
+          <w:color w:val="000000" w:themeColor="text1"/>
+        </w:rPr>
+      </w:pPr>
+      <w:r>
+        <w:t xml:space="preserve">Short films should be no longer than </w:t>
+      </w:r>
+      <w:r>
+        <w:t>10</w:t>
+      </w:r>
+      <w:r>
+        <w:t xml:space="preserve"> minutes. Artists will be responsible for providing any specialist equipment required for playback unless otherwise agreed with the </w:t>
+      </w:r>
+      <w:proofErr w:type="spellStart"/>
+      <w:r>
+        <w:t>organising</w:t>
+      </w:r>
+      <w:proofErr w:type="spellEnd"/>
+      <w:r>
+        <w:t xml:space="preserve"> team.</w:t>
       </w:r>
     </w:p>
     <w:p>
@@ -1596,7 +1855,7 @@
         <w:rPr>
           <w:color w:val="000000" w:themeColor="text1"/>
         </w:rPr>
-        <w:t>Works will be selected by a five-member selection committee through a blind selection process.</w:t>
+        <w:t>Works will be selected by a five-member selection committee.</w:t>
       </w:r>
     </w:p>
     <w:p>
@@ -1628,7 +1887,19 @@
         <w:rPr>
           <w:color w:val="000000" w:themeColor="text1"/>
         </w:rPr>
-        <w:t xml:space="preserve"> artists, gallery staff and individuals with lived experience of subfertility.</w:t>
+        <w:t xml:space="preserve"> artists, gallery staff and individuals with lived</w:t>
+      </w:r>
+      <w:r>
+        <w:rPr>
+          <w:color w:val="000000" w:themeColor="text1"/>
+        </w:rPr>
+        <w:t xml:space="preserve"> </w:t>
+      </w:r>
+      <w:r>
+        <w:rPr>
+          <w:color w:val="000000" w:themeColor="text1"/>
+        </w:rPr>
+        <w:t>experience of subfertility.</w:t>
       </w:r>
     </w:p>
     <w:p>
@@ -1638,6 +1909,7 @@
           <w:ilvl w:val="0"/>
           <w:numId w:val="16"/>
         </w:numPr>
+        <w:spacing w:after="0"/>
         <w:rPr>
           <w:color w:val="000000" w:themeColor="text1"/>
         </w:rPr>
@@ -1647,10 +1919,133 @@
           <w:color w:val="000000" w:themeColor="text1"/>
         </w:rPr>
         <w:t>Selection will be based on the work’s thematic relevance to the exhibition, as well as its suitability in terms of scale and dimensions for display within the gallery</w:t>
+      </w:r>
+      <w:r>
+        <w:rPr>
+          <w:color w:val="000000" w:themeColor="text1"/>
+        </w:rPr>
+        <w:t>.</w:t>
       </w:r>
     </w:p>
     <w:p>
       <w:pPr>
+        <w:pStyle w:val="ListBullet"/>
+        <w:numPr>
+          <w:ilvl w:val="0"/>
+          <w:numId w:val="16"/>
+        </w:numPr>
+        <w:spacing w:after="0"/>
+        <w:rPr>
+          <w:b/>
+          <w:bCs/>
+          <w:color w:val="000000" w:themeColor="text1"/>
+          <w:lang w:val="en-GB"/>
+        </w:rPr>
+      </w:pPr>
+      <w:r>
+        <w:t>The selection process will be conducted on a blind basis</w:t>
+      </w:r>
+      <w:r>
+        <w:t>.</w:t>
+      </w:r>
+      <w:r>
+        <w:t xml:space="preserve"> </w:t>
+      </w:r>
+      <w:r>
+        <w:t>I</w:t>
+      </w:r>
+      <w:r>
+        <w:t xml:space="preserve">dentifying information will be removed from submissions before they are shared with the selection committee, </w:t>
+      </w:r>
+      <w:proofErr w:type="gramStart"/>
+      <w:r>
+        <w:t>where</w:t>
+      </w:r>
+      <w:proofErr w:type="gramEnd"/>
+      <w:r>
+        <w:t xml:space="preserve"> reasonably practicable.</w:t>
+      </w:r>
+    </w:p>
+    <w:p>
+      <w:pPr>
+        <w:pStyle w:val="ListBullet"/>
+        <w:numPr>
+          <w:ilvl w:val="0"/>
+          <w:numId w:val="16"/>
+        </w:numPr>
+        <w:spacing w:after="0"/>
+        <w:rPr>
+          <w:b/>
+          <w:bCs/>
+          <w:color w:val="000000" w:themeColor="text1"/>
+          <w:lang w:val="en-GB"/>
+        </w:rPr>
+      </w:pPr>
+      <w:r>
+        <w:rPr>
+          <w:color w:val="000000" w:themeColor="text1"/>
+        </w:rPr>
+        <w:t xml:space="preserve">The decision of the </w:t>
+      </w:r>
+      <w:r>
+        <w:rPr>
+          <w:color w:val="000000" w:themeColor="text1"/>
+        </w:rPr>
+        <w:t>s</w:t>
+      </w:r>
+      <w:r>
+        <w:rPr>
+          <w:color w:val="000000" w:themeColor="text1"/>
+        </w:rPr>
+        <w:t xml:space="preserve">election </w:t>
+      </w:r>
+      <w:r>
+        <w:rPr>
+          <w:color w:val="000000" w:themeColor="text1"/>
+        </w:rPr>
+        <w:t>c</w:t>
+      </w:r>
+      <w:r>
+        <w:rPr>
+          <w:color w:val="000000" w:themeColor="text1"/>
+        </w:rPr>
+        <w:t xml:space="preserve">ommittee is </w:t>
+      </w:r>
+      <w:proofErr w:type="gramStart"/>
+      <w:r>
+        <w:rPr>
+          <w:color w:val="000000" w:themeColor="text1"/>
+        </w:rPr>
+        <w:t>final</w:t>
+      </w:r>
+      <w:proofErr w:type="gramEnd"/>
+      <w:r>
+        <w:rPr>
+          <w:color w:val="000000" w:themeColor="text1"/>
+        </w:rPr>
+        <w:t xml:space="preserve"> and we are unable to offer feedback.</w:t>
+      </w:r>
+    </w:p>
+    <w:p>
+      <w:pPr>
+        <w:pStyle w:val="ListParagraph"/>
+        <w:numPr>
+          <w:ilvl w:val="0"/>
+          <w:numId w:val="16"/>
+        </w:numPr>
+        <w:rPr>
+          <w:b/>
+          <w:bCs/>
+          <w:color w:val="000000" w:themeColor="text1"/>
+          <w:lang w:val="en-GB"/>
+        </w:rPr>
+      </w:pPr>
+      <w:r>
+        <w:t>Selection does not guarantee inclusion if the artwork materially differs from that presented during the application process or does not meet the requirements of the exhibition.</w:t>
+      </w:r>
+    </w:p>
+    <w:p>
+      <w:pPr>
         <w:pStyle w:val="Heading2"/>
         <w:rPr>
           <w:color w:val="000000" w:themeColor="text1"/>
@@ -1660,6 +2055,7 @@
         <w:rPr>
           <w:color w:val="000000" w:themeColor="text1"/>
         </w:rPr>
+        <w:lastRenderedPageBreak/>
         <w:t>4. Size</w:t>
       </w:r>
     </w:p>
@@ -1693,10 +2089,13 @@
         </w:rPr>
       </w:pPr>
       <w:r>
-        <w:rPr>
-          <w:color w:val="000000" w:themeColor="text1"/>
-        </w:rPr>
-        <w:t xml:space="preserve">All sculptural work should not exceed 100cm. </w:t>
+        <w:t>Sculptural work must not exceed 100 cm in any dimension</w:t>
+      </w:r>
+      <w:r>
+        <w:rPr>
+          <w:color w:val="000000" w:themeColor="text1"/>
+        </w:rPr>
+        <w:t xml:space="preserve">. </w:t>
       </w:r>
     </w:p>
     <w:p>
@@ -1746,7 +2145,19 @@
         <w:rPr>
           <w:color w:val="000000" w:themeColor="text1"/>
         </w:rPr>
-        <w:t xml:space="preserve">Selected artists must be able to deliver and deinstall their work in person. </w:t>
+        <w:t xml:space="preserve">Selected artists must be able to deliver and </w:t>
+      </w:r>
+      <w:r>
+        <w:rPr>
+          <w:color w:val="000000" w:themeColor="text1"/>
+        </w:rPr>
+        <w:t>collect</w:t>
+      </w:r>
+      <w:r>
+        <w:rPr>
+          <w:color w:val="000000" w:themeColor="text1"/>
+        </w:rPr>
+        <w:t xml:space="preserve"> their work in person. </w:t>
       </w:r>
     </w:p>
     <w:p>
@@ -1764,38 +2175,81 @@
         <w:rPr>
           <w:color w:val="000000" w:themeColor="text1"/>
         </w:rPr>
-        <w:t>Delivery is scheduled for Saturday 14 November, from 10am to 2pm, at Oaklands Social.</w:t>
+        <w:t xml:space="preserve">Delivery is scheduled for </w:t>
+      </w:r>
+      <w:r>
+        <w:rPr>
+          <w:color w:val="000000" w:themeColor="text1"/>
+          <w:highlight w:val="yellow"/>
+        </w:rPr>
+        <w:t>Saturday 14 November,</w:t>
+      </w:r>
+      <w:r>
+        <w:rPr>
+          <w:color w:val="000000" w:themeColor="text1"/>
+        </w:rPr>
+        <w:t xml:space="preserve"> from 10am to 2pm, at Oaklands Social.</w:t>
       </w:r>
     </w:p>
     <w:p>
       <w:pPr>
-        <w:pStyle w:val="Heading2"/>
-        <w:rPr>
-          <w:color w:val="000000" w:themeColor="text1"/>
-        </w:rPr>
-      </w:pPr>
-      <w:r>
-        <w:rPr>
-          <w:color w:val="000000" w:themeColor="text1"/>
-        </w:rPr>
-        <w:t>6. Exhibition</w:t>
+        <w:pStyle w:val="ListParagraph"/>
+        <w:numPr>
+          <w:ilvl w:val="0"/>
+          <w:numId w:val="11"/>
+        </w:numPr>
+        <w:rPr>
+          <w:color w:val="000000" w:themeColor="text1"/>
+        </w:rPr>
+      </w:pPr>
+      <w:r>
+        <w:t xml:space="preserve">Collection will take place on </w:t>
+      </w:r>
+      <w:r>
+        <w:rPr>
+          <w:highlight w:val="yellow"/>
+        </w:rPr>
+        <w:t>Sunday 29 November</w:t>
+      </w:r>
+      <w:r>
+        <w:t xml:space="preserve"> at the same location from 10am to 2pm.</w:t>
       </w:r>
     </w:p>
     <w:p>
       <w:pPr>
-        <w:rPr>
-          <w:color w:val="000000" w:themeColor="text1"/>
-        </w:rPr>
-      </w:pPr>
-      <w:r>
-        <w:rPr>
-          <w:color w:val="000000" w:themeColor="text1"/>
-        </w:rPr>
-        <w:t>Selected works will be exhibited at Oaklands Social – Bow Arts from Monday 16 November to Saturday 28 November.</w:t>
+        <w:pStyle w:val="Heading2"/>
+        <w:rPr>
+          <w:color w:val="000000" w:themeColor="text1"/>
+        </w:rPr>
+      </w:pPr>
+      <w:r>
+        <w:rPr>
+          <w:color w:val="000000" w:themeColor="text1"/>
+        </w:rPr>
+        <w:t xml:space="preserve">6. </w:t>
+      </w:r>
+      <w:r>
+        <w:rPr>
+          <w:color w:val="000000" w:themeColor="text1"/>
+        </w:rPr>
+        <w:t>Installation and safety</w:t>
       </w:r>
     </w:p>
     <w:p>
       <w:pPr>
+        <w:rPr>
+          <w:lang w:val="en-GB"/>
+        </w:rPr>
+      </w:pPr>
+      <w:r>
+        <w:rPr>
+          <w:lang w:val="en-GB"/>
+        </w:rPr>
+        <w:t>All submitted work must be safe and suitable for public exhibition. The organising team reserves the right to decline the installation or display of work where it considers that the work presents a health, safety, accessibility or practical installation concern.</w:t>
+      </w:r>
+    </w:p>
+    <w:p>
+      <w:pPr>
         <w:pStyle w:val="Heading2"/>
         <w:rPr>
           <w:color w:val="000000" w:themeColor="text1"/>
@@ -1805,8 +2259,288 @@
         <w:rPr>
           <w:color w:val="000000" w:themeColor="text1"/>
         </w:rPr>
-        <w:lastRenderedPageBreak/>
-        <w:t>7. Costs</w:t>
+        <w:t>7</w:t>
+      </w:r>
+      <w:r>
+        <w:rPr>
+          <w:color w:val="000000" w:themeColor="text1"/>
+        </w:rPr>
+        <w:t xml:space="preserve">. </w:t>
+      </w:r>
+      <w:r>
+        <w:rPr>
+          <w:color w:val="000000" w:themeColor="text1"/>
+        </w:rPr>
+        <w:t>Transport and responsibility for artwork</w:t>
+      </w:r>
+    </w:p>
+    <w:p>
+      <w:pPr>
+        <w:pStyle w:val="ListParagraph"/>
+        <w:numPr>
+          <w:ilvl w:val="0"/>
+          <w:numId w:val="22"/>
+        </w:numPr>
+      </w:pPr>
+      <w:r>
+        <w:t>Artists are responsible for the safe transportation of their work to and from the exhibition venue.</w:t>
+      </w:r>
+    </w:p>
+    <w:p>
+      <w:pPr>
+        <w:pStyle w:val="ListParagraph"/>
+        <w:numPr>
+          <w:ilvl w:val="0"/>
+          <w:numId w:val="22"/>
+        </w:numPr>
+      </w:pPr>
+      <w:r>
+        <w:t>Artists should ensure that their work is appropriately packaged and protected during transport.</w:t>
+      </w:r>
+    </w:p>
+    <w:p>
+      <w:pPr>
+        <w:pStyle w:val="Heading2"/>
+        <w:rPr>
+          <w:color w:val="000000" w:themeColor="text1"/>
+        </w:rPr>
+      </w:pPr>
+      <w:r>
+        <w:rPr>
+          <w:color w:val="000000" w:themeColor="text1"/>
+        </w:rPr>
+        <w:t>8</w:t>
+      </w:r>
+      <w:r>
+        <w:rPr>
+          <w:color w:val="000000" w:themeColor="text1"/>
+        </w:rPr>
+        <w:t xml:space="preserve">. </w:t>
+      </w:r>
+      <w:r>
+        <w:rPr>
+          <w:color w:val="000000" w:themeColor="text1"/>
+        </w:rPr>
+        <w:t>Collection of artwork and uncollected work</w:t>
+      </w:r>
+    </w:p>
+    <w:p>
+      <w:pPr>
+        <w:pStyle w:val="ListParagraph"/>
+        <w:numPr>
+          <w:ilvl w:val="0"/>
+          <w:numId w:val="23"/>
+        </w:numPr>
+      </w:pPr>
+      <w:r>
+        <w:t xml:space="preserve">Artists are responsible for collecting their work from the venue on the specified collection date. </w:t>
+      </w:r>
+    </w:p>
+    <w:p>
+      <w:pPr>
+        <w:pStyle w:val="ListParagraph"/>
+        <w:numPr>
+          <w:ilvl w:val="0"/>
+          <w:numId w:val="23"/>
+        </w:numPr>
+      </w:pPr>
+      <w:r>
+        <w:t xml:space="preserve">The </w:t>
+      </w:r>
+      <w:proofErr w:type="spellStart"/>
+      <w:r>
+        <w:t>organising</w:t>
+      </w:r>
+      <w:proofErr w:type="spellEnd"/>
+      <w:r>
+        <w:t xml:space="preserve"> team cannot guarantee storage of works after the collection date. </w:t>
+      </w:r>
+    </w:p>
+    <w:p>
+      <w:pPr>
+        <w:pStyle w:val="ListParagraph"/>
+        <w:numPr>
+          <w:ilvl w:val="0"/>
+          <w:numId w:val="23"/>
+        </w:numPr>
+      </w:pPr>
+      <w:r>
+        <w:t xml:space="preserve">Any alternative collection arrangements must be agreed with the </w:t>
+      </w:r>
+      <w:proofErr w:type="spellStart"/>
+      <w:r>
+        <w:t>organising</w:t>
+      </w:r>
+      <w:proofErr w:type="spellEnd"/>
+      <w:r>
+        <w:t xml:space="preserve"> team in advance.</w:t>
+      </w:r>
+    </w:p>
+    <w:p>
+      <w:pPr>
+        <w:pStyle w:val="Heading2"/>
+        <w:rPr>
+          <w:color w:val="000000" w:themeColor="text1"/>
+        </w:rPr>
+      </w:pPr>
+      <w:r>
+        <w:rPr>
+          <w:color w:val="000000" w:themeColor="text1"/>
+        </w:rPr>
+        <w:t>9</w:t>
+      </w:r>
+      <w:r>
+        <w:rPr>
+          <w:color w:val="000000" w:themeColor="text1"/>
+        </w:rPr>
+        <w:t xml:space="preserve">. </w:t>
+      </w:r>
+      <w:r>
+        <w:rPr>
+          <w:color w:val="000000" w:themeColor="text1"/>
+        </w:rPr>
+        <w:t>Content and safeguarding</w:t>
+      </w:r>
+    </w:p>
+    <w:p>
+      <w:pPr>
+        <w:pStyle w:val="ListParagraph"/>
+        <w:numPr>
+          <w:ilvl w:val="0"/>
+          <w:numId w:val="24"/>
+        </w:numPr>
+      </w:pPr>
+      <w:r>
+        <w:t>Artists must identify any potentially sensitive, distressing or explicit content in their application</w:t>
+      </w:r>
+      <w:r>
+        <w:t xml:space="preserve"> in the “Notes on artwork” section of the submission form</w:t>
+      </w:r>
+      <w:r>
+        <w:t xml:space="preserve">. </w:t>
+      </w:r>
+    </w:p>
+    <w:p>
+      <w:pPr>
+        <w:pStyle w:val="ListParagraph"/>
+        <w:numPr>
+          <w:ilvl w:val="0"/>
+          <w:numId w:val="24"/>
+        </w:numPr>
+      </w:pPr>
+      <w:r>
+        <w:t xml:space="preserve">The </w:t>
+      </w:r>
+      <w:r>
+        <w:pgNum/>
+      </w:r>
+      <w:proofErr w:type="spellStart"/>
+      <w:r>
+        <w:t>ublicizin</w:t>
+      </w:r>
+      <w:proofErr w:type="spellEnd"/>
+      <w:r>
+        <w:t xml:space="preserve"> team reserves the right to determine how such work is displayed and whether appropriate content information or warnings are required.</w:t>
+      </w:r>
+    </w:p>
+    <w:p>
+      <w:pPr>
+        <w:pStyle w:val="Heading2"/>
+        <w:rPr>
+          <w:color w:val="000000" w:themeColor="text1"/>
+        </w:rPr>
+      </w:pPr>
+      <w:r>
+        <w:rPr>
+          <w:color w:val="000000" w:themeColor="text1"/>
+        </w:rPr>
+        <w:t>10</w:t>
+      </w:r>
+      <w:r>
+        <w:rPr>
+          <w:color w:val="000000" w:themeColor="text1"/>
+        </w:rPr>
+        <w:t>. Exhibition</w:t>
+      </w:r>
+    </w:p>
+    <w:p>
+      <w:pPr>
+        <w:pStyle w:val="ListParagraph"/>
+        <w:numPr>
+          <w:ilvl w:val="0"/>
+          <w:numId w:val="21"/>
+        </w:numPr>
+        <w:rPr>
+          <w:color w:val="000000" w:themeColor="text1"/>
+        </w:rPr>
+      </w:pPr>
+      <w:r>
+        <w:rPr>
+          <w:color w:val="000000" w:themeColor="text1"/>
+        </w:rPr>
+        <w:t xml:space="preserve">Selected works will be exhibited at Oaklands Social – Bow Arts </w:t>
+      </w:r>
+      <w:r>
+        <w:rPr>
+          <w:color w:val="000000" w:themeColor="text1"/>
+        </w:rPr>
+        <w:t xml:space="preserve">during the dates specified </w:t>
+      </w:r>
+      <w:r>
+        <w:rPr>
+          <w:color w:val="000000" w:themeColor="text1"/>
+        </w:rPr>
+        <w:t>from 10am to 2pm.</w:t>
+      </w:r>
+    </w:p>
+    <w:p>
+      <w:pPr>
+        <w:pStyle w:val="ListParagraph"/>
+        <w:numPr>
+          <w:ilvl w:val="0"/>
+          <w:numId w:val="21"/>
+        </w:numPr>
+        <w:rPr>
+          <w:color w:val="000000" w:themeColor="text1"/>
+        </w:rPr>
+      </w:pPr>
+      <w:r>
+        <w:rPr>
+          <w:color w:val="000000" w:themeColor="text1"/>
+        </w:rPr>
+        <w:t>Selected artists will be asked to undertake 1</w:t>
+      </w:r>
+      <w:r>
+        <w:rPr>
+          <w:color w:val="000000" w:themeColor="text1"/>
+        </w:rPr>
+        <w:t>–</w:t>
+      </w:r>
+      <w:r>
+        <w:rPr>
+          <w:color w:val="000000" w:themeColor="text1"/>
+        </w:rPr>
+        <w:t>2 half-days of invigilation during the exhibition, from 10am to 2pm.</w:t>
+      </w:r>
+    </w:p>
+    <w:p>
+      <w:pPr>
+        <w:pStyle w:val="Heading2"/>
+        <w:rPr>
+          <w:color w:val="000000" w:themeColor="text1"/>
+        </w:rPr>
+      </w:pPr>
+      <w:r>
+        <w:rPr>
+          <w:color w:val="000000" w:themeColor="text1"/>
+        </w:rPr>
+        <w:t>11</w:t>
+      </w:r>
+      <w:r>
+        <w:rPr>
+          <w:color w:val="000000" w:themeColor="text1"/>
+        </w:rPr>
+        <w:t>. Costs</w:t>
       </w:r>
     </w:p>
     <w:p>
@@ -1824,13 +2558,7 @@
         <w:rPr>
           <w:color w:val="000000" w:themeColor="text1"/>
         </w:rPr>
-        <w:t>This is a self-funded, not-for-profit project.</w:t>
-      </w:r>
-      <w:r>
-        <w:rPr>
-          <w:color w:val="000000" w:themeColor="text1"/>
-        </w:rPr>
-        <w:t xml:space="preserve"> </w:t>
+        <w:t xml:space="preserve">This is a self-funded, not-for-profit project. </w:t>
       </w:r>
     </w:p>
     <w:p>
@@ -1877,6 +2605,81 @@
     </w:p>
     <w:p>
       <w:pPr>
+        <w:pStyle w:val="ListParagraph"/>
+        <w:numPr>
+          <w:ilvl w:val="0"/>
+          <w:numId w:val="12"/>
+        </w:numPr>
+        <w:rPr>
+          <w:color w:val="000000" w:themeColor="text1"/>
+        </w:rPr>
+      </w:pPr>
+      <w:r>
+        <w:t>Artists are responsible for managing any sales of their work, including setting prices, arranging payment and fulfilling any sale following the exhibition.</w:t>
+      </w:r>
+    </w:p>
+    <w:p>
+      <w:pPr>
+        <w:pStyle w:val="ListParagraph"/>
+        <w:numPr>
+          <w:ilvl w:val="0"/>
+          <w:numId w:val="12"/>
+        </w:numPr>
+        <w:rPr>
+          <w:color w:val="000000" w:themeColor="text1"/>
+        </w:rPr>
+      </w:pPr>
+      <w:r>
+        <w:t>Artists are responsible for any costs associated with the creation, framing, packaging, transportation, installation</w:t>
+      </w:r>
+      <w:r>
+        <w:t>, sale</w:t>
+      </w:r>
+      <w:r>
+        <w:t xml:space="preserve"> and collection of their work unless otherwise agreed with the </w:t>
+      </w:r>
+      <w:proofErr w:type="spellStart"/>
+      <w:r>
+        <w:t>organising</w:t>
+      </w:r>
+      <w:proofErr w:type="spellEnd"/>
+      <w:r>
+        <w:t xml:space="preserve"> team.</w:t>
+      </w:r>
+    </w:p>
+    <w:p>
+      <w:pPr>
+        <w:numPr>
+          <w:ilvl w:val="0"/>
+          <w:numId w:val="12"/>
+        </w:numPr>
+        <w:spacing w:after="0"/>
+        <w:rPr>
+          <w:lang w:val="en-GB"/>
+        </w:rPr>
+      </w:pPr>
+      <w:r>
+        <w:rPr>
+          <w:lang w:val="en-GB"/>
+        </w:rPr>
+        <w:lastRenderedPageBreak/>
+        <w:t xml:space="preserve">The organising team will not be responsible for costs incurred by artists in connection with participation in the exhibition, including materials, framing, </w:t>
+      </w:r>
+      <w:r>
+        <w:rPr>
+          <w:lang w:val="en-GB"/>
+        </w:rPr>
+        <w:t xml:space="preserve">insurance, </w:t>
+      </w:r>
+      <w:r>
+        <w:rPr>
+          <w:lang w:val="en-GB"/>
+        </w:rPr>
+        <w:t xml:space="preserve">transport, travel or accommodation. </w:t>
+      </w:r>
+    </w:p>
+    <w:p>
+      <w:pPr>
         <w:pStyle w:val="Heading2"/>
         <w:rPr>
           <w:color w:val="000000" w:themeColor="text1"/>
@@ -1886,7 +2689,13 @@
         <w:rPr>
           <w:color w:val="000000" w:themeColor="text1"/>
         </w:rPr>
-        <w:t xml:space="preserve">7. </w:t>
+        <w:t>12</w:t>
+      </w:r>
+      <w:r>
+        <w:rPr>
+          <w:color w:val="000000" w:themeColor="text1"/>
+        </w:rPr>
+        <w:t xml:space="preserve">. </w:t>
       </w:r>
       <w:r>
         <w:rPr>
@@ -1904,7 +2713,16 @@
         </w:numPr>
       </w:pPr>
       <w:r>
-        <w:t xml:space="preserve">You will be required to have your own public liability insurance and artist insurance. </w:t>
+        <w:t>Artists are responsible for arranging appropriate insurance for their artwork and public liability cover.</w:t>
+      </w:r>
+      <w:r>
+        <w:t xml:space="preserve"> Proof of a</w:t>
+      </w:r>
+      <w:r>
+        <w:t>ppropriate</w:t>
+      </w:r>
+      <w:r>
+        <w:t xml:space="preserve"> insurance will be requested if selected.</w:t>
       </w:r>
     </w:p>
     <w:p>
@@ -1916,58 +2734,356 @@
         </w:numPr>
       </w:pPr>
       <w:r>
-        <w:t>You will be asked to complete a short risk assessment for the Gallery.</w:t>
+        <w:t>Artists are responsible for ensuring that their work is appropriately insured against loss or damage during transportation and exhibition.</w:t>
       </w:r>
     </w:p>
     <w:p>
       <w:pPr>
-        <w:pStyle w:val="Heading2"/>
-        <w:rPr>
-          <w:color w:val="000000" w:themeColor="text1"/>
-        </w:rPr>
-      </w:pPr>
-      <w:r>
-        <w:rPr>
-          <w:color w:val="000000" w:themeColor="text1"/>
-        </w:rPr>
-        <w:t xml:space="preserve">7. </w:t>
-      </w:r>
-      <w:r>
-        <w:rPr>
-          <w:color w:val="000000" w:themeColor="text1"/>
-        </w:rPr>
-        <w:t>Copyright, reproduction and promotional image permissions</w:t>
+        <w:pStyle w:val="ListParagraph"/>
+        <w:numPr>
+          <w:ilvl w:val="0"/>
+          <w:numId w:val="15"/>
+        </w:numPr>
+      </w:pPr>
+      <w:r>
+        <w:t>Artists</w:t>
+      </w:r>
+      <w:r>
+        <w:t xml:space="preserve"> will be asked to complete a short risk assessment for the </w:t>
+      </w:r>
+      <w:r>
+        <w:t>venue</w:t>
+      </w:r>
+      <w:r>
+        <w:t>.</w:t>
       </w:r>
     </w:p>
     <w:p>
+      <w:pPr>
+        <w:pStyle w:val="Heading2"/>
+        <w:rPr>
+          <w:color w:val="000000" w:themeColor="text1"/>
+        </w:rPr>
+      </w:pPr>
+      <w:r>
+        <w:rPr>
+          <w:color w:val="000000" w:themeColor="text1"/>
+        </w:rPr>
+        <w:t>13</w:t>
+      </w:r>
+      <w:r>
+        <w:rPr>
+          <w:color w:val="000000" w:themeColor="text1"/>
+        </w:rPr>
+        <w:t xml:space="preserve">. </w:t>
+      </w:r>
+      <w:r>
+        <w:rPr>
+          <w:color w:val="000000" w:themeColor="text1"/>
+        </w:rPr>
+        <w:t>Copyright, reproduction and promotional image permissions</w:t>
+      </w:r>
+    </w:p>
+    <w:p>
+      <w:pPr>
+        <w:pStyle w:val="ListParagraph"/>
+        <w:numPr>
+          <w:ilvl w:val="0"/>
+          <w:numId w:val="20"/>
+        </w:numPr>
+      </w:pPr>
       <w:r>
         <w:t xml:space="preserve">By accepting selection for the exhibition, the artist grants the </w:t>
       </w:r>
+      <w:r>
+        <w:pgNum/>
+      </w:r>
       <w:proofErr w:type="spellStart"/>
       <w:r>
+        <w:t>ublicizin</w:t>
+      </w:r>
+      <w:proofErr w:type="spellEnd"/>
+      <w:r>
+        <w:t xml:space="preserve"> team a non-exclusive, royalty-free </w:t>
+      </w:r>
+      <w:proofErr w:type="spellStart"/>
+      <w:r>
+        <w:t>licence</w:t>
+      </w:r>
+      <w:proofErr w:type="spellEnd"/>
+      <w:r>
+        <w:t xml:space="preserve"> to photograph, reproduce and publish images of their submitted artwork for the purposes of documenting, promoting and </w:t>
+      </w:r>
+      <w:r>
+        <w:pgNum/>
+      </w:r>
+      <w:proofErr w:type="spellStart"/>
+      <w:r>
+        <w:t>ublicizing</w:t>
+      </w:r>
+      <w:proofErr w:type="spellEnd"/>
+      <w:r>
+        <w:t xml:space="preserve"> the exhibition. This includes, but is not limited to, use on the exhibition website, social media platforms, press materials and other promotional communications. The artist will be credited wherever reasonably practicable.</w:t>
+      </w:r>
+    </w:p>
+    <w:p>
+      <w:pPr>
+        <w:pStyle w:val="ListParagraph"/>
+        <w:numPr>
+          <w:ilvl w:val="0"/>
+          <w:numId w:val="20"/>
+        </w:numPr>
+      </w:pPr>
+      <w:r>
+        <w:t>Where an artwork contains identifiable individuals, third-party images, music, text or other copyrighted material, artists are responsible for obtaining any necessary permissions and consents.</w:t>
+      </w:r>
+    </w:p>
+    <w:p>
+      <w:pPr>
+        <w:pStyle w:val="Heading2"/>
+        <w:rPr>
+          <w:color w:val="000000" w:themeColor="text1"/>
+        </w:rPr>
+      </w:pPr>
+      <w:r>
+        <w:rPr>
+          <w:color w:val="000000" w:themeColor="text1"/>
+        </w:rPr>
+        <w:t>14</w:t>
+      </w:r>
+      <w:r>
+        <w:rPr>
+          <w:color w:val="000000" w:themeColor="text1"/>
+        </w:rPr>
+        <w:t xml:space="preserve">. </w:t>
+      </w:r>
+      <w:r>
+        <w:rPr>
+          <w:color w:val="000000" w:themeColor="text1"/>
+        </w:rPr>
+        <w:t>Ownership and originality of artwork</w:t>
+      </w:r>
+    </w:p>
+    <w:p>
+      <w:pPr>
+        <w:pStyle w:val="ListParagraph"/>
+        <w:numPr>
+          <w:ilvl w:val="0"/>
+          <w:numId w:val="26"/>
+        </w:numPr>
+      </w:pPr>
+      <w:r>
+        <w:t xml:space="preserve">Artists confirm that they are the creator and rights holder of the submitted </w:t>
+      </w:r>
+      <w:proofErr w:type="gramStart"/>
+      <w:r>
+        <w:t>work, or</w:t>
+      </w:r>
+      <w:proofErr w:type="gramEnd"/>
+      <w:r>
+        <w:t xml:space="preserve"> have obtained all necessary permissions to submit and exhibit it. </w:t>
+      </w:r>
+    </w:p>
+    <w:p>
+      <w:pPr>
+        <w:pStyle w:val="ListParagraph"/>
+        <w:numPr>
+          <w:ilvl w:val="0"/>
+          <w:numId w:val="26"/>
+        </w:numPr>
+      </w:pPr>
+      <w:r>
+        <w:t>Artists are responsible for ensuring that their work does not infringe the copyright, intellectual property or other rights of any third party.</w:t>
+      </w:r>
+    </w:p>
+    <w:p>
+      <w:pPr>
+        <w:pStyle w:val="Heading2"/>
+        <w:rPr>
+          <w:color w:val="000000" w:themeColor="text1"/>
+        </w:rPr>
+      </w:pPr>
+      <w:r>
+        <w:rPr>
+          <w:color w:val="000000" w:themeColor="text1"/>
+        </w:rPr>
+        <w:t>15</w:t>
+      </w:r>
+      <w:r>
+        <w:rPr>
+          <w:color w:val="000000" w:themeColor="text1"/>
+        </w:rPr>
+        <w:t xml:space="preserve">. </w:t>
+      </w:r>
+      <w:r>
+        <w:rPr>
+          <w:color w:val="000000" w:themeColor="text1"/>
+        </w:rPr>
+        <w:t>Changes or cancellation of the exhibition</w:t>
+      </w:r>
+    </w:p>
+    <w:p>
+      <w:pPr>
+        <w:numPr>
+          <w:ilvl w:val="0"/>
+          <w:numId w:val="18"/>
+        </w:numPr>
+        <w:spacing w:after="0"/>
+        <w:rPr>
+          <w:lang w:val="en-GB"/>
+        </w:rPr>
+      </w:pPr>
+      <w:r>
+        <w:rPr>
+          <w:b/>
+          <w:bCs/>
+          <w:lang w:val="en-GB"/>
+        </w:rPr>
+        <w:t>Artist withdrawal:</w:t>
+      </w:r>
+      <w:r>
+        <w:rPr>
+          <w:lang w:val="en-GB"/>
+        </w:rPr>
+        <w:t xml:space="preserve"> Selected artists must notify the organising team as soon as possible if they are no longer able to participate. The organising team reserves the right to withdraw an artist's work if agreed submission, delivery or installation requirements are not met. </w:t>
+      </w:r>
+    </w:p>
+    <w:p>
+      <w:pPr>
+        <w:numPr>
+          <w:ilvl w:val="0"/>
+          <w:numId w:val="18"/>
+        </w:numPr>
+        <w:spacing w:after="0"/>
+        <w:rPr>
+          <w:lang w:val="en-GB"/>
+        </w:rPr>
+      </w:pPr>
+      <w:r>
+        <w:rPr>
+          <w:b/>
+          <w:bCs/>
+          <w:lang w:val="en-GB"/>
+        </w:rPr>
+        <w:t>Cancellation or postponement:</w:t>
+      </w:r>
+      <w:r>
+        <w:rPr>
+          <w:lang w:val="en-GB"/>
+        </w:rPr>
+        <w:t xml:space="preserve"> The organising team reserves the right to cancel, postpone or make reasonable changes to the exhibition, including to the dates, venue, format or participating artists, where circumstances beyond its reasonable control make this necessary. </w:t>
+      </w:r>
+    </w:p>
+    <w:p>
+      <w:pPr>
+        <w:numPr>
+          <w:ilvl w:val="0"/>
+          <w:numId w:val="18"/>
+        </w:numPr>
+        <w:spacing w:after="0"/>
+        <w:rPr>
+          <w:lang w:val="en-GB"/>
+        </w:rPr>
+      </w:pPr>
+      <w:r>
+        <w:rPr>
+          <w:b/>
+          <w:bCs/>
+          <w:lang w:val="en-GB"/>
+        </w:rPr>
+        <w:t>Unforeseen circumstances:</w:t>
+      </w:r>
+      <w:r>
+        <w:rPr>
+          <w:lang w:val="en-GB"/>
+        </w:rPr>
+        <w:t xml:space="preserve"> If the exhibition is cancelled or postponed due to circumstances beyond the organising team's reasonable control, selected artists will be notified as soon as reasonably practicable. </w:t>
+      </w:r>
+    </w:p>
+    <w:p>
+      <w:pPr>
+        <w:numPr>
+          <w:ilvl w:val="0"/>
+          <w:numId w:val="18"/>
+        </w:numPr>
+        <w:rPr>
+          <w:lang w:val="en-GB"/>
+        </w:rPr>
+      </w:pPr>
+      <w:r>
+        <w:rPr>
+          <w:b/>
+          <w:bCs/>
+          <w:lang w:val="en-GB"/>
+        </w:rPr>
+        <w:t>No guarantee of exhibition:</w:t>
+      </w:r>
+      <w:r>
+        <w:rPr>
+          <w:lang w:val="en-GB"/>
+        </w:rPr>
+        <w:t xml:space="preserve"> Selection does not guarantee that the exhibition will proceed or that selected work will be exhibited for the full advertised exhibition period where circumstances beyond the organising team's reasonable control prevent this.</w:t>
+      </w:r>
+    </w:p>
+    <w:p>
+      <w:pPr>
+        <w:pStyle w:val="Heading2"/>
+        <w:rPr>
+          <w:color w:val="000000" w:themeColor="text1"/>
+        </w:rPr>
+      </w:pPr>
+      <w:r>
+        <w:rPr>
+          <w:color w:val="000000" w:themeColor="text1"/>
+        </w:rPr>
+        <w:t>16</w:t>
+      </w:r>
+      <w:r>
+        <w:rPr>
+          <w:color w:val="000000" w:themeColor="text1"/>
+        </w:rPr>
+        <w:t xml:space="preserve">. </w:t>
+      </w:r>
+      <w:r>
+        <w:rPr>
+          <w:color w:val="000000" w:themeColor="text1"/>
+        </w:rPr>
+        <w:t>Data protection / use of application information</w:t>
+      </w:r>
+    </w:p>
+    <w:p>
+      <w:pPr>
+        <w:pStyle w:val="ListParagraph"/>
+        <w:numPr>
+          <w:ilvl w:val="0"/>
+          <w:numId w:val="28"/>
+        </w:numPr>
+      </w:pPr>
+      <w:r>
+        <w:t xml:space="preserve">Personal information provided as part of the application will be used for the purposes of administering the open call, contacting applicants, </w:t>
+      </w:r>
+      <w:proofErr w:type="spellStart"/>
+      <w:r>
         <w:t>organising</w:t>
       </w:r>
       <w:proofErr w:type="spellEnd"/>
       <w:r>
-        <w:t xml:space="preserve"> team a non-exclusive, royalty-free </w:t>
-      </w:r>
-      <w:proofErr w:type="spellStart"/>
-      <w:r>
-        <w:t>licence</w:t>
-      </w:r>
-      <w:proofErr w:type="spellEnd"/>
-      <w:r>
-        <w:t xml:space="preserve"> to photograph, reproduce and publish images of their submitted artwork for the purposes of documenting, promoting and </w:t>
-      </w:r>
-      <w:proofErr w:type="spellStart"/>
-      <w:r>
-        <w:t>publicising</w:t>
-      </w:r>
-      <w:proofErr w:type="spellEnd"/>
-      <w:r>
-        <w:t xml:space="preserve"> the exhibition. This includes, but is not limited to, use on the exhibition website, social media platforms, press materials and other promotional communications. The artist will be credited wherever reasonably practicable.</w:t>
+        <w:t xml:space="preserve"> the exhibition and managing participation. </w:t>
       </w:r>
     </w:p>
+    <w:p>
+      <w:pPr>
+        <w:pStyle w:val="ListParagraph"/>
+        <w:numPr>
+          <w:ilvl w:val="0"/>
+          <w:numId w:val="28"/>
+        </w:numPr>
+      </w:pPr>
+      <w:r>
+        <w:t>Personal information will be handled in accordance with applicable data protection legislation.</w:t>
+      </w:r>
+    </w:p>
+    <w:p/>
     <w:sectPr>
       <w:pgSz w:w="12240" w:h="15840"/>
       <w:pgMar w:top="1020" w:right="1134" w:bottom="1020" w:left="1134" w:header="720" w:footer="720" w:gutter="0"/>
@@ -2133,7 +3249,7 @@
   <w:abstractNum w:abstractNumId="8" w15:restartNumberingAfterBreak="0">
     <w:nsid w:val="FFFFFF89"/>
     <w:multiLevelType w:val="singleLevel"/>
-    <w:tmpl w:val="B39A9C32"/>
+    <w:tmpl w:val="168C4D28"/>
     <w:lvl w:ilvl="0">
       <w:start w:val="1"/>
       <w:numFmt w:val="bullet"/>
@@ -2265,6 +3381,119 @@
     </w:lvl>
   </w:abstractNum>
   <w:abstractNum w:abstractNumId="10" w15:restartNumberingAfterBreak="0">
+    <w:nsid w:val="1C151772"/>
+    <w:multiLevelType w:val="hybridMultilevel"/>
+    <w:tmpl w:val="466051AE"/>
+    <w:lvl w:ilvl="0" w:tplc="08090001">
+      <w:start w:val="1"/>
+      <w:numFmt w:val="bullet"/>
+      <w:lvlText w:val=""/>
+      <w:lvlJc w:val="left"/>
+      <w:pPr>
+        <w:ind w:left="720" w:hanging="360"/>
+      </w:pPr>
+      <w:rPr>
+        <w:rFonts w:ascii="Symbol" w:hAnsi="Symbol" w:hint="default"/>
+      </w:rPr>
+    </w:lvl>
+    <w:lvl w:ilvl="1" w:tplc="08090003" w:tentative="1">
+      <w:start w:val="1"/>
+      <w:numFmt w:val="bullet"/>
+      <w:lvlText w:val="o"/>
+      <w:lvlJc w:val="left"/>
+      <w:pPr>
+        <w:ind w:left="1440" w:hanging="360"/>
+      </w:pPr>
+      <w:rPr>
+        <w:rFonts w:ascii="Courier New" w:hAnsi="Courier New" w:cs="Courier New" w:hint="default"/>
+      </w:rPr>
+    </w:lvl>
+    <w:lvl w:ilvl="2" w:tplc="08090005" w:tentative="1">
+      <w:start w:val="1"/>
+      <w:numFmt w:val="bullet"/>
+      <w:lvlText w:val=""/>
+      <w:lvlJc w:val="left"/>
+      <w:pPr>
+        <w:ind w:left="2160" w:hanging="360"/>
+      </w:pPr>
+      <w:rPr>
+        <w:rFonts w:ascii="Wingdings" w:hAnsi="Wingdings" w:hint="default"/>
+      </w:rPr>
+    </w:lvl>
+    <w:lvl w:ilvl="3" w:tplc="08090001" w:tentative="1">
+      <w:start w:val="1"/>
+      <w:numFmt w:val="bullet"/>
+      <w:lvlText w:val=""/>
+      <w:lvlJc w:val="left"/>
+      <w:pPr>
+        <w:ind w:left="2880" w:hanging="360"/>
+      </w:pPr>
+      <w:rPr>
+        <w:rFonts w:ascii="Symbol" w:hAnsi="Symbol" w:hint="default"/>
+      </w:rPr>
+    </w:lvl>
+    <w:lvl w:ilvl="4" w:tplc="08090003" w:tentative="1">
+      <w:start w:val="1"/>
+      <w:numFmt w:val="bullet"/>
+      <w:lvlText w:val="o"/>
+      <w:lvlJc w:val="left"/>
+      <w:pPr>
+        <w:ind w:left="3600" w:hanging="360"/>
+      </w:pPr>
+      <w:rPr>
+        <w:rFonts w:ascii="Courier New" w:hAnsi="Courier New" w:cs="Courier New" w:hint="default"/>
+      </w:rPr>
+    </w:lvl>
+    <w:lvl w:ilvl="5" w:tplc="08090005" w:tentative="1">
+      <w:start w:val="1"/>
+      <w:numFmt w:val="bullet"/>
+      <w:lvlText w:val=""/>
+      <w:lvlJc w:val="left"/>
+      <w:pPr>
+        <w:ind w:left="4320" w:hanging="360"/>
+      </w:pPr>
+      <w:rPr>
+        <w:rFonts w:ascii="Wingdings" w:hAnsi="Wingdings" w:hint="default"/>
+      </w:rPr>
+    </w:lvl>
+    <w:lvl w:ilvl="6" w:tplc="08090001" w:tentative="1">
+      <w:start w:val="1"/>
+      <w:numFmt w:val="bullet"/>
+      <w:lvlText w:val=""/>
+      <w:lvlJc w:val="left"/>
+      <w:pPr>
+        <w:ind w:left="5040" w:hanging="360"/>
+      </w:pPr>
+      <w:rPr>
+        <w:rFonts w:ascii="Symbol" w:hAnsi="Symbol" w:hint="default"/>
+      </w:rPr>
+    </w:lvl>
+    <w:lvl w:ilvl="7" w:tplc="08090003" w:tentative="1">
+      <w:start w:val="1"/>
+      <w:numFmt w:val="bullet"/>
+      <w:lvlText w:val="o"/>
+      <w:lvlJc w:val="left"/>
+      <w:pPr>
+        <w:ind w:left="5760" w:hanging="360"/>
+      </w:pPr>
+      <w:rPr>
+        <w:rFonts w:ascii="Courier New" w:hAnsi="Courier New" w:cs="Courier New" w:hint="default"/>
+      </w:rPr>
+    </w:lvl>
+    <w:lvl w:ilvl="8" w:tplc="08090005" w:tentative="1">
+      <w:start w:val="1"/>
+      <w:numFmt w:val="bullet"/>
+      <w:lvlText w:val=""/>
+      <w:lvlJc w:val="left"/>
+      <w:pPr>
+        <w:ind w:left="6480" w:hanging="360"/>
+      </w:pPr>
+      <w:rPr>
+        <w:rFonts w:ascii="Wingdings" w:hAnsi="Wingdings" w:hint="default"/>
+      </w:rPr>
+    </w:lvl>
+  </w:abstractNum>
+  <w:abstractNum w:abstractNumId="11" w15:restartNumberingAfterBreak="0">
     <w:nsid w:val="23BC0F4F"/>
     <w:multiLevelType w:val="hybridMultilevel"/>
     <w:tmpl w:val="02DAB262"/>
@@ -2377,7 +3606,382 @@
       </w:rPr>
     </w:lvl>
   </w:abstractNum>
-  <w:abstractNum w:abstractNumId="11" w15:restartNumberingAfterBreak="0">
+  <w:abstractNum w:abstractNumId="12" w15:restartNumberingAfterBreak="0">
+    <w:nsid w:val="27A107C3"/>
+    <w:multiLevelType w:val="hybridMultilevel"/>
+    <w:tmpl w:val="C5E47582"/>
+    <w:lvl w:ilvl="0" w:tplc="08090001">
+      <w:start w:val="1"/>
+      <w:numFmt w:val="bullet"/>
+      <w:lvlText w:val=""/>
+      <w:lvlJc w:val="left"/>
+      <w:pPr>
+        <w:ind w:left="720" w:hanging="360"/>
+      </w:pPr>
+      <w:rPr>
+        <w:rFonts w:ascii="Symbol" w:hAnsi="Symbol" w:hint="default"/>
+      </w:rPr>
+    </w:lvl>
+    <w:lvl w:ilvl="1" w:tplc="08090003" w:tentative="1">
+      <w:start w:val="1"/>
+      <w:numFmt w:val="bullet"/>
+      <w:lvlText w:val="o"/>
+      <w:lvlJc w:val="left"/>
+      <w:pPr>
+        <w:ind w:left="1440" w:hanging="360"/>
+      </w:pPr>
+      <w:rPr>
+        <w:rFonts w:ascii="Courier New" w:hAnsi="Courier New" w:cs="Courier New" w:hint="default"/>
+      </w:rPr>
+    </w:lvl>
+    <w:lvl w:ilvl="2" w:tplc="08090005" w:tentative="1">
+      <w:start w:val="1"/>
+      <w:numFmt w:val="bullet"/>
+      <w:lvlText w:val=""/>
+      <w:lvlJc w:val="left"/>
+      <w:pPr>
+        <w:ind w:left="2160" w:hanging="360"/>
+      </w:pPr>
+      <w:rPr>
+        <w:rFonts w:ascii="Wingdings" w:hAnsi="Wingdings" w:hint="default"/>
+      </w:rPr>
+    </w:lvl>
+    <w:lvl w:ilvl="3" w:tplc="08090001" w:tentative="1">
+      <w:start w:val="1"/>
+      <w:numFmt w:val="bullet"/>
+      <w:lvlText w:val=""/>
+      <w:lvlJc w:val="left"/>
+      <w:pPr>
+        <w:ind w:left="2880" w:hanging="360"/>
+      </w:pPr>
+      <w:rPr>
+        <w:rFonts w:ascii="Symbol" w:hAnsi="Symbol" w:hint="default"/>
+      </w:rPr>
+    </w:lvl>
+    <w:lvl w:ilvl="4" w:tplc="08090003" w:tentative="1">
+      <w:start w:val="1"/>
+      <w:numFmt w:val="bullet"/>
+      <w:lvlText w:val="o"/>
+      <w:lvlJc w:val="left"/>
+      <w:pPr>
+        <w:ind w:left="3600" w:hanging="360"/>
+      </w:pPr>
+      <w:rPr>
+        <w:rFonts w:ascii="Courier New" w:hAnsi="Courier New" w:cs="Courier New" w:hint="default"/>
+      </w:rPr>
+    </w:lvl>
+    <w:lvl w:ilvl="5" w:tplc="08090005" w:tentative="1">
+      <w:start w:val="1"/>
+      <w:numFmt w:val="bullet"/>
+      <w:lvlText w:val=""/>
+      <w:lvlJc w:val="left"/>
+      <w:pPr>
+        <w:ind w:left="4320" w:hanging="360"/>
+      </w:pPr>
+      <w:rPr>
+        <w:rFonts w:ascii="Wingdings" w:hAnsi="Wingdings" w:hint="default"/>
+      </w:rPr>
+    </w:lvl>
+    <w:lvl w:ilvl="6" w:tplc="08090001" w:tentative="1">
+      <w:start w:val="1"/>
+      <w:numFmt w:val="bullet"/>
+      <w:lvlText w:val=""/>
+      <w:lvlJc w:val="left"/>
+      <w:pPr>
+        <w:ind w:left="5040" w:hanging="360"/>
+      </w:pPr>
+      <w:rPr>
+        <w:rFonts w:ascii="Symbol" w:hAnsi="Symbol" w:hint="default"/>
+      </w:rPr>
+    </w:lvl>
+    <w:lvl w:ilvl="7" w:tplc="08090003" w:tentative="1">
+      <w:start w:val="1"/>
+      <w:numFmt w:val="bullet"/>
+      <w:lvlText w:val="o"/>
+      <w:lvlJc w:val="left"/>
+      <w:pPr>
+        <w:ind w:left="5760" w:hanging="360"/>
+      </w:pPr>
+      <w:rPr>
+        <w:rFonts w:ascii="Courier New" w:hAnsi="Courier New" w:cs="Courier New" w:hint="default"/>
+      </w:rPr>
+    </w:lvl>
+    <w:lvl w:ilvl="8" w:tplc="08090005" w:tentative="1">
+      <w:start w:val="1"/>
+      <w:numFmt w:val="bullet"/>
+      <w:lvlText w:val=""/>
+      <w:lvlJc w:val="left"/>
+      <w:pPr>
+        <w:ind w:left="6480" w:hanging="360"/>
+      </w:pPr>
+      <w:rPr>
+        <w:rFonts w:ascii="Wingdings" w:hAnsi="Wingdings" w:hint="default"/>
+      </w:rPr>
+    </w:lvl>
+  </w:abstractNum>
+  <w:abstractNum w:abstractNumId="13" w15:restartNumberingAfterBreak="0">
+    <w:nsid w:val="27B159AD"/>
+    <w:multiLevelType w:val="hybridMultilevel"/>
+    <w:tmpl w:val="1F0C7C52"/>
+    <w:lvl w:ilvl="0" w:tplc="08090001">
+      <w:start w:val="1"/>
+      <w:numFmt w:val="bullet"/>
+      <w:lvlText w:val=""/>
+      <w:lvlJc w:val="left"/>
+      <w:pPr>
+        <w:ind w:left="720" w:hanging="360"/>
+      </w:pPr>
+      <w:rPr>
+        <w:rFonts w:ascii="Symbol" w:hAnsi="Symbol" w:hint="default"/>
+      </w:rPr>
+    </w:lvl>
+    <w:lvl w:ilvl="1" w:tplc="08090003" w:tentative="1">
+      <w:start w:val="1"/>
+      <w:numFmt w:val="bullet"/>
+      <w:lvlText w:val="o"/>
+      <w:lvlJc w:val="left"/>
+      <w:pPr>
+        <w:ind w:left="1440" w:hanging="360"/>
+      </w:pPr>
+      <w:rPr>
+        <w:rFonts w:ascii="Courier New" w:hAnsi="Courier New" w:cs="Courier New" w:hint="default"/>
+      </w:rPr>
+    </w:lvl>
+    <w:lvl w:ilvl="2" w:tplc="08090005" w:tentative="1">
+      <w:start w:val="1"/>
+      <w:numFmt w:val="bullet"/>
+      <w:lvlText w:val=""/>
+      <w:lvlJc w:val="left"/>
+      <w:pPr>
+        <w:ind w:left="2160" w:hanging="360"/>
+      </w:pPr>
+      <w:rPr>
+        <w:rFonts w:ascii="Wingdings" w:hAnsi="Wingdings" w:hint="default"/>
+      </w:rPr>
+    </w:lvl>
+    <w:lvl w:ilvl="3" w:tplc="08090001" w:tentative="1">
+      <w:start w:val="1"/>
+      <w:numFmt w:val="bullet"/>
+      <w:lvlText w:val=""/>
+      <w:lvlJc w:val="left"/>
+      <w:pPr>
+        <w:ind w:left="2880" w:hanging="360"/>
+      </w:pPr>
+      <w:rPr>
+        <w:rFonts w:ascii="Symbol" w:hAnsi="Symbol" w:hint="default"/>
+      </w:rPr>
+    </w:lvl>
+    <w:lvl w:ilvl="4" w:tplc="08090003" w:tentative="1">
+      <w:start w:val="1"/>
+      <w:numFmt w:val="bullet"/>
+      <w:lvlText w:val="o"/>
+      <w:lvlJc w:val="left"/>
+      <w:pPr>
+        <w:ind w:left="3600" w:hanging="360"/>
+      </w:pPr>
+      <w:rPr>
+        <w:rFonts w:ascii="Courier New" w:hAnsi="Courier New" w:cs="Courier New" w:hint="default"/>
+      </w:rPr>
+    </w:lvl>
+    <w:lvl w:ilvl="5" w:tplc="08090005" w:tentative="1">
+      <w:start w:val="1"/>
+      <w:numFmt w:val="bullet"/>
+      <w:lvlText w:val=""/>
+      <w:lvlJc w:val="left"/>
+      <w:pPr>
+        <w:ind w:left="4320" w:hanging="360"/>
+      </w:pPr>
+      <w:rPr>
+        <w:rFonts w:ascii="Wingdings" w:hAnsi="Wingdings" w:hint="default"/>
+      </w:rPr>
+    </w:lvl>
+    <w:lvl w:ilvl="6" w:tplc="08090001" w:tentative="1">
+      <w:start w:val="1"/>
+      <w:numFmt w:val="bullet"/>
+      <w:lvlText w:val=""/>
+      <w:lvlJc w:val="left"/>
+      <w:pPr>
+        <w:ind w:left="5040" w:hanging="360"/>
+      </w:pPr>
+      <w:rPr>
+        <w:rFonts w:ascii="Symbol" w:hAnsi="Symbol" w:hint="default"/>
+      </w:rPr>
+    </w:lvl>
+    <w:lvl w:ilvl="7" w:tplc="08090003" w:tentative="1">
+      <w:start w:val="1"/>
+      <w:numFmt w:val="bullet"/>
+      <w:lvlText w:val="o"/>
+      <w:lvlJc w:val="left"/>
+      <w:pPr>
+        <w:ind w:left="5760" w:hanging="360"/>
+      </w:pPr>
+      <w:rPr>
+        <w:rFonts w:ascii="Courier New" w:hAnsi="Courier New" w:cs="Courier New" w:hint="default"/>
+      </w:rPr>
+    </w:lvl>
+    <w:lvl w:ilvl="8" w:tplc="08090005" w:tentative="1">
+      <w:start w:val="1"/>
+      <w:numFmt w:val="bullet"/>
+      <w:lvlText w:val=""/>
+      <w:lvlJc w:val="left"/>
+      <w:pPr>
+        <w:ind w:left="6480" w:hanging="360"/>
+      </w:pPr>
+      <w:rPr>
+        <w:rFonts w:ascii="Wingdings" w:hAnsi="Wingdings" w:hint="default"/>
+      </w:rPr>
+    </w:lvl>
+  </w:abstractNum>
+  <w:abstractNum w:abstractNumId="14" w15:restartNumberingAfterBreak="0">
+    <w:nsid w:val="2CA26CC8"/>
+    <w:multiLevelType w:val="multilevel"/>
+    <w:tmpl w:val="F5704B78"/>
+    <w:lvl w:ilvl="0">
+      <w:start w:val="1"/>
+      <w:numFmt w:val="bullet"/>
+      <w:lvlText w:val=""/>
+      <w:lvlJc w:val="left"/>
+      <w:pPr>
+        <w:tabs>
+          <w:tab w:val="num" w:pos="720"/>
+        </w:tabs>
+        <w:ind w:left="720" w:hanging="360"/>
+      </w:pPr>
+      <w:rPr>
+        <w:rFonts w:ascii="Symbol" w:hAnsi="Symbol" w:hint="default"/>
+        <w:sz w:val="20"/>
+      </w:rPr>
+    </w:lvl>
+    <w:lvl w:ilvl="1" w:tentative="1">
+      <w:start w:val="1"/>
+      <w:numFmt w:val="bullet"/>
+      <w:lvlText w:val="o"/>
+      <w:lvlJc w:val="left"/>
+      <w:pPr>
+        <w:tabs>
+          <w:tab w:val="num" w:pos="1440"/>
+        </w:tabs>
+        <w:ind w:left="1440" w:hanging="360"/>
+      </w:pPr>
+      <w:rPr>
+        <w:rFonts w:ascii="Courier New" w:hAnsi="Courier New" w:hint="default"/>
+        <w:sz w:val="20"/>
+      </w:rPr>
+    </w:lvl>
+    <w:lvl w:ilvl="2" w:tentative="1">
+      <w:start w:val="1"/>
+      <w:numFmt w:val="bullet"/>
+      <w:lvlText w:val=""/>
+      <w:lvlJc w:val="left"/>
+      <w:pPr>
+        <w:tabs>
+          <w:tab w:val="num" w:pos="2160"/>
+        </w:tabs>
+        <w:ind w:left="2160" w:hanging="360"/>
+      </w:pPr>
+      <w:rPr>
+        <w:rFonts w:ascii="Wingdings" w:hAnsi="Wingdings" w:hint="default"/>
+        <w:sz w:val="20"/>
+      </w:rPr>
+    </w:lvl>
+    <w:lvl w:ilvl="3" w:tentative="1">
+      <w:start w:val="1"/>
+      <w:numFmt w:val="bullet"/>
+      <w:lvlText w:val=""/>
+      <w:lvlJc w:val="left"/>
+      <w:pPr>
+        <w:tabs>
+          <w:tab w:val="num" w:pos="2880"/>
+        </w:tabs>
+        <w:ind w:left="2880" w:hanging="360"/>
+      </w:pPr>
+      <w:rPr>
+        <w:rFonts w:ascii="Wingdings" w:hAnsi="Wingdings" w:hint="default"/>
+        <w:sz w:val="20"/>
+      </w:rPr>
+    </w:lvl>
+    <w:lvl w:ilvl="4" w:tentative="1">
+      <w:start w:val="1"/>
+      <w:numFmt w:val="bullet"/>
+      <w:lvlText w:val=""/>
+      <w:lvlJc w:val="left"/>
+      <w:pPr>
+        <w:tabs>
+          <w:tab w:val="num" w:pos="3600"/>
+        </w:tabs>
+        <w:ind w:left="3600" w:hanging="360"/>
+      </w:pPr>
+      <w:rPr>
+        <w:rFonts w:ascii="Wingdings" w:hAnsi="Wingdings" w:hint="default"/>
+        <w:sz w:val="20"/>
+      </w:rPr>
+    </w:lvl>
+    <w:lvl w:ilvl="5" w:tentative="1">
+      <w:start w:val="1"/>
+      <w:numFmt w:val="bullet"/>
+      <w:lvlText w:val=""/>
+      <w:lvlJc w:val="left"/>
+      <w:pPr>
+        <w:tabs>
+          <w:tab w:val="num" w:pos="4320"/>
+        </w:tabs>
+        <w:ind w:left="4320" w:hanging="360"/>
+      </w:pPr>
+      <w:rPr>
+        <w:rFonts w:ascii="Wingdings" w:hAnsi="Wingdings" w:hint="default"/>
+        <w:sz w:val="20"/>
+      </w:rPr>
+    </w:lvl>
+    <w:lvl w:ilvl="6" w:tentative="1">
+      <w:start w:val="1"/>
+      <w:numFmt w:val="bullet"/>
+      <w:lvlText w:val=""/>
+      <w:lvlJc w:val="left"/>
+      <w:pPr>
+        <w:tabs>
+          <w:tab w:val="num" w:pos="5040"/>
+        </w:tabs>
+        <w:ind w:left="5040" w:hanging="360"/>
+      </w:pPr>
+      <w:rPr>
+        <w:rFonts w:ascii="Wingdings" w:hAnsi="Wingdings" w:hint="default"/>
+        <w:sz w:val="20"/>
+      </w:rPr>
+    </w:lvl>
+    <w:lvl w:ilvl="7" w:tentative="1">
+      <w:start w:val="1"/>
+      <w:numFmt w:val="bullet"/>
+      <w:lvlText w:val=""/>
+      <w:lvlJc w:val="left"/>
+      <w:pPr>
+        <w:tabs>
+          <w:tab w:val="num" w:pos="5760"/>
+        </w:tabs>
+        <w:ind w:left="5760" w:hanging="360"/>
+      </w:pPr>
+      <w:rPr>
+        <w:rFonts w:ascii="Wingdings" w:hAnsi="Wingdings" w:hint="default"/>
+        <w:sz w:val="20"/>
+      </w:rPr>
+    </w:lvl>
+    <w:lvl w:ilvl="8" w:tentative="1">
+      <w:start w:val="1"/>
+      <w:numFmt w:val="bullet"/>
+      <w:lvlText w:val=""/>
+      <w:lvlJc w:val="left"/>
+      <w:pPr>
+        <w:tabs>
+          <w:tab w:val="num" w:pos="6480"/>
+        </w:tabs>
+        <w:ind w:left="6480" w:hanging="360"/>
+      </w:pPr>
+      <w:rPr>
+        <w:rFonts w:ascii="Wingdings" w:hAnsi="Wingdings" w:hint="default"/>
+        <w:sz w:val="20"/>
+      </w:rPr>
+    </w:lvl>
+  </w:abstractNum>
+  <w:abstractNum w:abstractNumId="15" w15:restartNumberingAfterBreak="0">
     <w:nsid w:val="31943781"/>
     <w:multiLevelType w:val="hybridMultilevel"/>
     <w:tmpl w:val="30047734"/>
@@ -2490,7 +4094,120 @@
       </w:rPr>
     </w:lvl>
   </w:abstractNum>
-  <w:abstractNum w:abstractNumId="12" w15:restartNumberingAfterBreak="0">
+  <w:abstractNum w:abstractNumId="16" w15:restartNumberingAfterBreak="0">
+    <w:nsid w:val="32935E10"/>
+    <w:multiLevelType w:val="hybridMultilevel"/>
+    <w:tmpl w:val="B426B710"/>
+    <w:lvl w:ilvl="0" w:tplc="08090001">
+      <w:start w:val="1"/>
+      <w:numFmt w:val="bullet"/>
+      <w:lvlText w:val=""/>
+      <w:lvlJc w:val="left"/>
+      <w:pPr>
+        <w:ind w:left="720" w:hanging="360"/>
+      </w:pPr>
+      <w:rPr>
+        <w:rFonts w:ascii="Symbol" w:hAnsi="Symbol" w:hint="default"/>
+      </w:rPr>
+    </w:lvl>
+    <w:lvl w:ilvl="1" w:tplc="08090003" w:tentative="1">
+      <w:start w:val="1"/>
+      <w:numFmt w:val="bullet"/>
+      <w:lvlText w:val="o"/>
+      <w:lvlJc w:val="left"/>
+      <w:pPr>
+        <w:ind w:left="1440" w:hanging="360"/>
+      </w:pPr>
+      <w:rPr>
+        <w:rFonts w:ascii="Courier New" w:hAnsi="Courier New" w:cs="Courier New" w:hint="default"/>
+      </w:rPr>
+    </w:lvl>
+    <w:lvl w:ilvl="2" w:tplc="08090005" w:tentative="1">
+      <w:start w:val="1"/>
+      <w:numFmt w:val="bullet"/>
+      <w:lvlText w:val=""/>
+      <w:lvlJc w:val="left"/>
+      <w:pPr>
+        <w:ind w:left="2160" w:hanging="360"/>
+      </w:pPr>
+      <w:rPr>
+        <w:rFonts w:ascii="Wingdings" w:hAnsi="Wingdings" w:hint="default"/>
+      </w:rPr>
+    </w:lvl>
+    <w:lvl w:ilvl="3" w:tplc="08090001" w:tentative="1">
+      <w:start w:val="1"/>
+      <w:numFmt w:val="bullet"/>
+      <w:lvlText w:val=""/>
+      <w:lvlJc w:val="left"/>
+      <w:pPr>
+        <w:ind w:left="2880" w:hanging="360"/>
+      </w:pPr>
+      <w:rPr>
+        <w:rFonts w:ascii="Symbol" w:hAnsi="Symbol" w:hint="default"/>
+      </w:rPr>
+    </w:lvl>
+    <w:lvl w:ilvl="4" w:tplc="08090003" w:tentative="1">
+      <w:start w:val="1"/>
+      <w:numFmt w:val="bullet"/>
+      <w:lvlText w:val="o"/>
+      <w:lvlJc w:val="left"/>
+      <w:pPr>
+        <w:ind w:left="3600" w:hanging="360"/>
+      </w:pPr>
+      <w:rPr>
+        <w:rFonts w:ascii="Courier New" w:hAnsi="Courier New" w:cs="Courier New" w:hint="default"/>
+      </w:rPr>
+    </w:lvl>
+    <w:lvl w:ilvl="5" w:tplc="08090005" w:tentative="1">
+      <w:start w:val="1"/>
+      <w:numFmt w:val="bullet"/>
+      <w:lvlText w:val=""/>
+      <w:lvlJc w:val="left"/>
+      <w:pPr>
+        <w:ind w:left="4320" w:hanging="360"/>
+      </w:pPr>
+      <w:rPr>
+        <w:rFonts w:ascii="Wingdings" w:hAnsi="Wingdings" w:hint="default"/>
+      </w:rPr>
+    </w:lvl>
+    <w:lvl w:ilvl="6" w:tplc="08090001" w:tentative="1">
+      <w:start w:val="1"/>
+      <w:numFmt w:val="bullet"/>
+      <w:lvlText w:val=""/>
+      <w:lvlJc w:val="left"/>
+      <w:pPr>
+        <w:ind w:left="5040" w:hanging="360"/>
+      </w:pPr>
+      <w:rPr>
+        <w:rFonts w:ascii="Symbol" w:hAnsi="Symbol" w:hint="default"/>
+      </w:rPr>
+    </w:lvl>
+    <w:lvl w:ilvl="7" w:tplc="08090003" w:tentative="1">
+      <w:start w:val="1"/>
+      <w:numFmt w:val="bullet"/>
+      <w:lvlText w:val="o"/>
+      <w:lvlJc w:val="left"/>
+      <w:pPr>
+        <w:ind w:left="5760" w:hanging="360"/>
+      </w:pPr>
+      <w:rPr>
+        <w:rFonts w:ascii="Courier New" w:hAnsi="Courier New" w:cs="Courier New" w:hint="default"/>
+      </w:rPr>
+    </w:lvl>
+    <w:lvl w:ilvl="8" w:tplc="08090005" w:tentative="1">
+      <w:start w:val="1"/>
+      <w:numFmt w:val="bullet"/>
+      <w:lvlText w:val=""/>
+      <w:lvlJc w:val="left"/>
+      <w:pPr>
+        <w:ind w:left="6480" w:hanging="360"/>
+      </w:pPr>
+      <w:rPr>
+        <w:rFonts w:ascii="Wingdings" w:hAnsi="Wingdings" w:hint="default"/>
+      </w:rPr>
+    </w:lvl>
+  </w:abstractNum>
+  <w:abstractNum w:abstractNumId="17" w15:restartNumberingAfterBreak="0">
     <w:nsid w:val="35176177"/>
     <w:multiLevelType w:val="hybridMultilevel"/>
     <w:tmpl w:val="B16E577A"/>
@@ -2603,7 +4320,120 @@
       </w:rPr>
     </w:lvl>
   </w:abstractNum>
-  <w:abstractNum w:abstractNumId="13" w15:restartNumberingAfterBreak="0">
+  <w:abstractNum w:abstractNumId="18" w15:restartNumberingAfterBreak="0">
+    <w:nsid w:val="44552518"/>
+    <w:multiLevelType w:val="hybridMultilevel"/>
+    <w:tmpl w:val="8410BAD4"/>
+    <w:lvl w:ilvl="0" w:tplc="08090001">
+      <w:start w:val="1"/>
+      <w:numFmt w:val="bullet"/>
+      <w:lvlText w:val=""/>
+      <w:lvlJc w:val="left"/>
+      <w:pPr>
+        <w:ind w:left="720" w:hanging="360"/>
+      </w:pPr>
+      <w:rPr>
+        <w:rFonts w:ascii="Symbol" w:hAnsi="Symbol" w:hint="default"/>
+      </w:rPr>
+    </w:lvl>
+    <w:lvl w:ilvl="1" w:tplc="08090003" w:tentative="1">
+      <w:start w:val="1"/>
+      <w:numFmt w:val="bullet"/>
+      <w:lvlText w:val="o"/>
+      <w:lvlJc w:val="left"/>
+      <w:pPr>
+        <w:ind w:left="1440" w:hanging="360"/>
+      </w:pPr>
+      <w:rPr>
+        <w:rFonts w:ascii="Courier New" w:hAnsi="Courier New" w:cs="Courier New" w:hint="default"/>
+      </w:rPr>
+    </w:lvl>
+    <w:lvl w:ilvl="2" w:tplc="08090005" w:tentative="1">
+      <w:start w:val="1"/>
+      <w:numFmt w:val="bullet"/>
+      <w:lvlText w:val=""/>
+      <w:lvlJc w:val="left"/>
+      <w:pPr>
+        <w:ind w:left="2160" w:hanging="360"/>
+      </w:pPr>
+      <w:rPr>
+        <w:rFonts w:ascii="Wingdings" w:hAnsi="Wingdings" w:hint="default"/>
+      </w:rPr>
+    </w:lvl>
+    <w:lvl w:ilvl="3" w:tplc="08090001" w:tentative="1">
+      <w:start w:val="1"/>
+      <w:numFmt w:val="bullet"/>
+      <w:lvlText w:val=""/>
+      <w:lvlJc w:val="left"/>
+      <w:pPr>
+        <w:ind w:left="2880" w:hanging="360"/>
+      </w:pPr>
+      <w:rPr>
+        <w:rFonts w:ascii="Symbol" w:hAnsi="Symbol" w:hint="default"/>
+      </w:rPr>
+    </w:lvl>
+    <w:lvl w:ilvl="4" w:tplc="08090003" w:tentative="1">
+      <w:start w:val="1"/>
+      <w:numFmt w:val="bullet"/>
+      <w:lvlText w:val="o"/>
+      <w:lvlJc w:val="left"/>
+      <w:pPr>
+        <w:ind w:left="3600" w:hanging="360"/>
+      </w:pPr>
+      <w:rPr>
+        <w:rFonts w:ascii="Courier New" w:hAnsi="Courier New" w:cs="Courier New" w:hint="default"/>
+      </w:rPr>
+    </w:lvl>
+    <w:lvl w:ilvl="5" w:tplc="08090005" w:tentative="1">
+      <w:start w:val="1"/>
+      <w:numFmt w:val="bullet"/>
+      <w:lvlText w:val=""/>
+      <w:lvlJc w:val="left"/>
+      <w:pPr>
+        <w:ind w:left="4320" w:hanging="360"/>
+      </w:pPr>
+      <w:rPr>
+        <w:rFonts w:ascii="Wingdings" w:hAnsi="Wingdings" w:hint="default"/>
+      </w:rPr>
+    </w:lvl>
+    <w:lvl w:ilvl="6" w:tplc="08090001" w:tentative="1">
+      <w:start w:val="1"/>
+      <w:numFmt w:val="bullet"/>
+      <w:lvlText w:val=""/>
+      <w:lvlJc w:val="left"/>
+      <w:pPr>
+        <w:ind w:left="5040" w:hanging="360"/>
+      </w:pPr>
+      <w:rPr>
+        <w:rFonts w:ascii="Symbol" w:hAnsi="Symbol" w:hint="default"/>
+      </w:rPr>
+    </w:lvl>
+    <w:lvl w:ilvl="7" w:tplc="08090003" w:tentative="1">
+      <w:start w:val="1"/>
+      <w:numFmt w:val="bullet"/>
+      <w:lvlText w:val="o"/>
+      <w:lvlJc w:val="left"/>
+      <w:pPr>
+        <w:ind w:left="5760" w:hanging="360"/>
+      </w:pPr>
+      <w:rPr>
+        <w:rFonts w:ascii="Courier New" w:hAnsi="Courier New" w:cs="Courier New" w:hint="default"/>
+      </w:rPr>
+    </w:lvl>
+    <w:lvl w:ilvl="8" w:tplc="08090005" w:tentative="1">
+      <w:start w:val="1"/>
+      <w:numFmt w:val="bullet"/>
+      <w:lvlText w:val=""/>
+      <w:lvlJc w:val="left"/>
+      <w:pPr>
+        <w:ind w:left="6480" w:hanging="360"/>
+      </w:pPr>
+      <w:rPr>
+        <w:rFonts w:ascii="Wingdings" w:hAnsi="Wingdings" w:hint="default"/>
+      </w:rPr>
+    </w:lvl>
+  </w:abstractNum>
+  <w:abstractNum w:abstractNumId="19" w15:restartNumberingAfterBreak="0">
     <w:nsid w:val="50DE16A1"/>
     <w:multiLevelType w:val="hybridMultilevel"/>
     <w:tmpl w:val="C9569D28"/>
@@ -2716,7 +4546,346 @@
       </w:rPr>
     </w:lvl>
   </w:abstractNum>
-  <w:abstractNum w:abstractNumId="14" w15:restartNumberingAfterBreak="0">
+  <w:abstractNum w:abstractNumId="20" w15:restartNumberingAfterBreak="0">
+    <w:nsid w:val="54894C09"/>
+    <w:multiLevelType w:val="hybridMultilevel"/>
+    <w:tmpl w:val="7FE043B4"/>
+    <w:lvl w:ilvl="0" w:tplc="08090001">
+      <w:start w:val="1"/>
+      <w:numFmt w:val="bullet"/>
+      <w:lvlText w:val=""/>
+      <w:lvlJc w:val="left"/>
+      <w:pPr>
+        <w:ind w:left="720" w:hanging="360"/>
+      </w:pPr>
+      <w:rPr>
+        <w:rFonts w:ascii="Symbol" w:hAnsi="Symbol" w:hint="default"/>
+      </w:rPr>
+    </w:lvl>
+    <w:lvl w:ilvl="1" w:tplc="08090003" w:tentative="1">
+      <w:start w:val="1"/>
+      <w:numFmt w:val="bullet"/>
+      <w:lvlText w:val="o"/>
+      <w:lvlJc w:val="left"/>
+      <w:pPr>
+        <w:ind w:left="1440" w:hanging="360"/>
+      </w:pPr>
+      <w:rPr>
+        <w:rFonts w:ascii="Courier New" w:hAnsi="Courier New" w:cs="Courier New" w:hint="default"/>
+      </w:rPr>
+    </w:lvl>
+    <w:lvl w:ilvl="2" w:tplc="08090005" w:tentative="1">
+      <w:start w:val="1"/>
+      <w:numFmt w:val="bullet"/>
+      <w:lvlText w:val=""/>
+      <w:lvlJc w:val="left"/>
+      <w:pPr>
+        <w:ind w:left="2160" w:hanging="360"/>
+      </w:pPr>
+      <w:rPr>
+        <w:rFonts w:ascii="Wingdings" w:hAnsi="Wingdings" w:hint="default"/>
+      </w:rPr>
+    </w:lvl>
+    <w:lvl w:ilvl="3" w:tplc="08090001" w:tentative="1">
+      <w:start w:val="1"/>
+      <w:numFmt w:val="bullet"/>
+      <w:lvlText w:val=""/>
+      <w:lvlJc w:val="left"/>
+      <w:pPr>
+        <w:ind w:left="2880" w:hanging="360"/>
+      </w:pPr>
+      <w:rPr>
+        <w:rFonts w:ascii="Symbol" w:hAnsi="Symbol" w:hint="default"/>
+      </w:rPr>
+    </w:lvl>
+    <w:lvl w:ilvl="4" w:tplc="08090003" w:tentative="1">
+      <w:start w:val="1"/>
+      <w:numFmt w:val="bullet"/>
+      <w:lvlText w:val="o"/>
+      <w:lvlJc w:val="left"/>
+      <w:pPr>
+        <w:ind w:left="3600" w:hanging="360"/>
+      </w:pPr>
+      <w:rPr>
+        <w:rFonts w:ascii="Courier New" w:hAnsi="Courier New" w:cs="Courier New" w:hint="default"/>
+      </w:rPr>
+    </w:lvl>
+    <w:lvl w:ilvl="5" w:tplc="08090005" w:tentative="1">
+      <w:start w:val="1"/>
+      <w:numFmt w:val="bullet"/>
+      <w:lvlText w:val=""/>
+      <w:lvlJc w:val="left"/>
+      <w:pPr>
+        <w:ind w:left="4320" w:hanging="360"/>
+      </w:pPr>
+      <w:rPr>
+        <w:rFonts w:ascii="Wingdings" w:hAnsi="Wingdings" w:hint="default"/>
+      </w:rPr>
+    </w:lvl>
+    <w:lvl w:ilvl="6" w:tplc="08090001" w:tentative="1">
+      <w:start w:val="1"/>
+      <w:numFmt w:val="bullet"/>
+      <w:lvlText w:val=""/>
+      <w:lvlJc w:val="left"/>
+      <w:pPr>
+        <w:ind w:left="5040" w:hanging="360"/>
+      </w:pPr>
+      <w:rPr>
+        <w:rFonts w:ascii="Symbol" w:hAnsi="Symbol" w:hint="default"/>
+      </w:rPr>
+    </w:lvl>
+    <w:lvl w:ilvl="7" w:tplc="08090003" w:tentative="1">
+      <w:start w:val="1"/>
+      <w:numFmt w:val="bullet"/>
+      <w:lvlText w:val="o"/>
+      <w:lvlJc w:val="left"/>
+      <w:pPr>
+        <w:ind w:left="5760" w:hanging="360"/>
+      </w:pPr>
+      <w:rPr>
+        <w:rFonts w:ascii="Courier New" w:hAnsi="Courier New" w:cs="Courier New" w:hint="default"/>
+      </w:rPr>
+    </w:lvl>
+    <w:lvl w:ilvl="8" w:tplc="08090005" w:tentative="1">
+      <w:start w:val="1"/>
+      <w:numFmt w:val="bullet"/>
+      <w:lvlText w:val=""/>
+      <w:lvlJc w:val="left"/>
+      <w:pPr>
+        <w:ind w:left="6480" w:hanging="360"/>
+      </w:pPr>
+      <w:rPr>
+        <w:rFonts w:ascii="Wingdings" w:hAnsi="Wingdings" w:hint="default"/>
+      </w:rPr>
+    </w:lvl>
+  </w:abstractNum>
+  <w:abstractNum w:abstractNumId="21" w15:restartNumberingAfterBreak="0">
+    <w:nsid w:val="566B0369"/>
+    <w:multiLevelType w:val="hybridMultilevel"/>
+    <w:tmpl w:val="ED324BFE"/>
+    <w:lvl w:ilvl="0" w:tplc="08090001">
+      <w:start w:val="1"/>
+      <w:numFmt w:val="bullet"/>
+      <w:lvlText w:val=""/>
+      <w:lvlJc w:val="left"/>
+      <w:pPr>
+        <w:ind w:left="720" w:hanging="360"/>
+      </w:pPr>
+      <w:rPr>
+        <w:rFonts w:ascii="Symbol" w:hAnsi="Symbol" w:hint="default"/>
+      </w:rPr>
+    </w:lvl>
+    <w:lvl w:ilvl="1" w:tplc="08090003" w:tentative="1">
+      <w:start w:val="1"/>
+      <w:numFmt w:val="bullet"/>
+      <w:lvlText w:val="o"/>
+      <w:lvlJc w:val="left"/>
+      <w:pPr>
+        <w:ind w:left="1440" w:hanging="360"/>
+      </w:pPr>
+      <w:rPr>
+        <w:rFonts w:ascii="Courier New" w:hAnsi="Courier New" w:cs="Courier New" w:hint="default"/>
+      </w:rPr>
+    </w:lvl>
+    <w:lvl w:ilvl="2" w:tplc="08090005" w:tentative="1">
+      <w:start w:val="1"/>
+      <w:numFmt w:val="bullet"/>
+      <w:lvlText w:val=""/>
+      <w:lvlJc w:val="left"/>
+      <w:pPr>
+        <w:ind w:left="2160" w:hanging="360"/>
+      </w:pPr>
+      <w:rPr>
+        <w:rFonts w:ascii="Wingdings" w:hAnsi="Wingdings" w:hint="default"/>
+      </w:rPr>
+    </w:lvl>
+    <w:lvl w:ilvl="3" w:tplc="08090001" w:tentative="1">
+      <w:start w:val="1"/>
+      <w:numFmt w:val="bullet"/>
+      <w:lvlText w:val=""/>
+      <w:lvlJc w:val="left"/>
+      <w:pPr>
+        <w:ind w:left="2880" w:hanging="360"/>
+      </w:pPr>
+      <w:rPr>
+        <w:rFonts w:ascii="Symbol" w:hAnsi="Symbol" w:hint="default"/>
+      </w:rPr>
+    </w:lvl>
+    <w:lvl w:ilvl="4" w:tplc="08090003" w:tentative="1">
+      <w:start w:val="1"/>
+      <w:numFmt w:val="bullet"/>
+      <w:lvlText w:val="o"/>
+      <w:lvlJc w:val="left"/>
+      <w:pPr>
+        <w:ind w:left="3600" w:hanging="360"/>
+      </w:pPr>
+      <w:rPr>
+        <w:rFonts w:ascii="Courier New" w:hAnsi="Courier New" w:cs="Courier New" w:hint="default"/>
+      </w:rPr>
+    </w:lvl>
+    <w:lvl w:ilvl="5" w:tplc="08090005" w:tentative="1">
+      <w:start w:val="1"/>
+      <w:numFmt w:val="bullet"/>
+      <w:lvlText w:val=""/>
+      <w:lvlJc w:val="left"/>
+      <w:pPr>
+        <w:ind w:left="4320" w:hanging="360"/>
+      </w:pPr>
+      <w:rPr>
+        <w:rFonts w:ascii="Wingdings" w:hAnsi="Wingdings" w:hint="default"/>
+      </w:rPr>
+    </w:lvl>
+    <w:lvl w:ilvl="6" w:tplc="08090001" w:tentative="1">
+      <w:start w:val="1"/>
+      <w:numFmt w:val="bullet"/>
+      <w:lvlText w:val=""/>
+      <w:lvlJc w:val="left"/>
+      <w:pPr>
+        <w:ind w:left="5040" w:hanging="360"/>
+      </w:pPr>
+      <w:rPr>
+        <w:rFonts w:ascii="Symbol" w:hAnsi="Symbol" w:hint="default"/>
+      </w:rPr>
+    </w:lvl>
+    <w:lvl w:ilvl="7" w:tplc="08090003" w:tentative="1">
+      <w:start w:val="1"/>
+      <w:numFmt w:val="bullet"/>
+      <w:lvlText w:val="o"/>
+      <w:lvlJc w:val="left"/>
+      <w:pPr>
+        <w:ind w:left="5760" w:hanging="360"/>
+      </w:pPr>
+      <w:rPr>
+        <w:rFonts w:ascii="Courier New" w:hAnsi="Courier New" w:cs="Courier New" w:hint="default"/>
+      </w:rPr>
+    </w:lvl>
+    <w:lvl w:ilvl="8" w:tplc="08090005" w:tentative="1">
+      <w:start w:val="1"/>
+      <w:numFmt w:val="bullet"/>
+      <w:lvlText w:val=""/>
+      <w:lvlJc w:val="left"/>
+      <w:pPr>
+        <w:ind w:left="6480" w:hanging="360"/>
+      </w:pPr>
+      <w:rPr>
+        <w:rFonts w:ascii="Wingdings" w:hAnsi="Wingdings" w:hint="default"/>
+      </w:rPr>
+    </w:lvl>
+  </w:abstractNum>
+  <w:abstractNum w:abstractNumId="22" w15:restartNumberingAfterBreak="0">
+    <w:nsid w:val="5B0D5D17"/>
+    <w:multiLevelType w:val="hybridMultilevel"/>
+    <w:tmpl w:val="1542C4B2"/>
+    <w:lvl w:ilvl="0" w:tplc="08090001">
+      <w:start w:val="1"/>
+      <w:numFmt w:val="bullet"/>
+      <w:lvlText w:val=""/>
+      <w:lvlJc w:val="left"/>
+      <w:pPr>
+        <w:ind w:left="720" w:hanging="360"/>
+      </w:pPr>
+      <w:rPr>
+        <w:rFonts w:ascii="Symbol" w:hAnsi="Symbol" w:hint="default"/>
+      </w:rPr>
+    </w:lvl>
+    <w:lvl w:ilvl="1" w:tplc="08090003" w:tentative="1">
+      <w:start w:val="1"/>
+      <w:numFmt w:val="bullet"/>
+      <w:lvlText w:val="o"/>
+      <w:lvlJc w:val="left"/>
+      <w:pPr>
+        <w:ind w:left="1440" w:hanging="360"/>
+      </w:pPr>
+      <w:rPr>
+        <w:rFonts w:ascii="Courier New" w:hAnsi="Courier New" w:cs="Courier New" w:hint="default"/>
+      </w:rPr>
+    </w:lvl>
+    <w:lvl w:ilvl="2" w:tplc="08090005" w:tentative="1">
+      <w:start w:val="1"/>
+      <w:numFmt w:val="bullet"/>
+      <w:lvlText w:val=""/>
+      <w:lvlJc w:val="left"/>
+      <w:pPr>
+        <w:ind w:left="2160" w:hanging="360"/>
+      </w:pPr>
+      <w:rPr>
+        <w:rFonts w:ascii="Wingdings" w:hAnsi="Wingdings" w:hint="default"/>
+      </w:rPr>
+    </w:lvl>
+    <w:lvl w:ilvl="3" w:tplc="08090001" w:tentative="1">
+      <w:start w:val="1"/>
+      <w:numFmt w:val="bullet"/>
+      <w:lvlText w:val=""/>
+      <w:lvlJc w:val="left"/>
+      <w:pPr>
+        <w:ind w:left="2880" w:hanging="360"/>
+      </w:pPr>
+      <w:rPr>
+        <w:rFonts w:ascii="Symbol" w:hAnsi="Symbol" w:hint="default"/>
+      </w:rPr>
+    </w:lvl>
+    <w:lvl w:ilvl="4" w:tplc="08090003" w:tentative="1">
+      <w:start w:val="1"/>
+      <w:numFmt w:val="bullet"/>
+      <w:lvlText w:val="o"/>
+      <w:lvlJc w:val="left"/>
+      <w:pPr>
+        <w:ind w:left="3600" w:hanging="360"/>
+      </w:pPr>
+      <w:rPr>
+        <w:rFonts w:ascii="Courier New" w:hAnsi="Courier New" w:cs="Courier New" w:hint="default"/>
+      </w:rPr>
+    </w:lvl>
+    <w:lvl w:ilvl="5" w:tplc="08090005" w:tentative="1">
+      <w:start w:val="1"/>
+      <w:numFmt w:val="bullet"/>
+      <w:lvlText w:val=""/>
+      <w:lvlJc w:val="left"/>
+      <w:pPr>
+        <w:ind w:left="4320" w:hanging="360"/>
+      </w:pPr>
+      <w:rPr>
+        <w:rFonts w:ascii="Wingdings" w:hAnsi="Wingdings" w:hint="default"/>
+      </w:rPr>
+    </w:lvl>
+    <w:lvl w:ilvl="6" w:tplc="08090001" w:tentative="1">
+      <w:start w:val="1"/>
+      <w:numFmt w:val="bullet"/>
+      <w:lvlText w:val=""/>
+      <w:lvlJc w:val="left"/>
+      <w:pPr>
+        <w:ind w:left="5040" w:hanging="360"/>
+      </w:pPr>
+      <w:rPr>
+        <w:rFonts w:ascii="Symbol" w:hAnsi="Symbol" w:hint="default"/>
+      </w:rPr>
+    </w:lvl>
+    <w:lvl w:ilvl="7" w:tplc="08090003" w:tentative="1">
+      <w:start w:val="1"/>
+      <w:numFmt w:val="bullet"/>
+      <w:lvlText w:val="o"/>
+      <w:lvlJc w:val="left"/>
+      <w:pPr>
+        <w:ind w:left="5760" w:hanging="360"/>
+      </w:pPr>
+      <w:rPr>
+        <w:rFonts w:ascii="Courier New" w:hAnsi="Courier New" w:cs="Courier New" w:hint="default"/>
+      </w:rPr>
+    </w:lvl>
+    <w:lvl w:ilvl="8" w:tplc="08090005" w:tentative="1">
+      <w:start w:val="1"/>
+      <w:numFmt w:val="bullet"/>
+      <w:lvlText w:val=""/>
+      <w:lvlJc w:val="left"/>
+      <w:pPr>
+        <w:ind w:left="6480" w:hanging="360"/>
+      </w:pPr>
+      <w:rPr>
+        <w:rFonts w:ascii="Wingdings" w:hAnsi="Wingdings" w:hint="default"/>
+      </w:rPr>
+    </w:lvl>
+  </w:abstractNum>
+  <w:abstractNum w:abstractNumId="23" w15:restartNumberingAfterBreak="0">
     <w:nsid w:val="62B15FF4"/>
     <w:multiLevelType w:val="hybridMultilevel"/>
     <w:tmpl w:val="D7E88134"/>
@@ -2829,7 +4998,120 @@
       </w:rPr>
     </w:lvl>
   </w:abstractNum>
-  <w:abstractNum w:abstractNumId="15" w15:restartNumberingAfterBreak="0">
+  <w:abstractNum w:abstractNumId="24" w15:restartNumberingAfterBreak="0">
+    <w:nsid w:val="6E016024"/>
+    <w:multiLevelType w:val="hybridMultilevel"/>
+    <w:tmpl w:val="218C59D8"/>
+    <w:lvl w:ilvl="0" w:tplc="08090001">
+      <w:start w:val="1"/>
+      <w:numFmt w:val="bullet"/>
+      <w:lvlText w:val=""/>
+      <w:lvlJc w:val="left"/>
+      <w:pPr>
+        <w:ind w:left="720" w:hanging="360"/>
+      </w:pPr>
+      <w:rPr>
+        <w:rFonts w:ascii="Symbol" w:hAnsi="Symbol" w:hint="default"/>
+      </w:rPr>
+    </w:lvl>
+    <w:lvl w:ilvl="1" w:tplc="08090003" w:tentative="1">
+      <w:start w:val="1"/>
+      <w:numFmt w:val="bullet"/>
+      <w:lvlText w:val="o"/>
+      <w:lvlJc w:val="left"/>
+      <w:pPr>
+        <w:ind w:left="1440" w:hanging="360"/>
+      </w:pPr>
+      <w:rPr>
+        <w:rFonts w:ascii="Courier New" w:hAnsi="Courier New" w:cs="Courier New" w:hint="default"/>
+      </w:rPr>
+    </w:lvl>
+    <w:lvl w:ilvl="2" w:tplc="08090005" w:tentative="1">
+      <w:start w:val="1"/>
+      <w:numFmt w:val="bullet"/>
+      <w:lvlText w:val=""/>
+      <w:lvlJc w:val="left"/>
+      <w:pPr>
+        <w:ind w:left="2160" w:hanging="360"/>
+      </w:pPr>
+      <w:rPr>
+        <w:rFonts w:ascii="Wingdings" w:hAnsi="Wingdings" w:hint="default"/>
+      </w:rPr>
+    </w:lvl>
+    <w:lvl w:ilvl="3" w:tplc="08090001" w:tentative="1">
+      <w:start w:val="1"/>
+      <w:numFmt w:val="bullet"/>
+      <w:lvlText w:val=""/>
+      <w:lvlJc w:val="left"/>
+      <w:pPr>
+        <w:ind w:left="2880" w:hanging="360"/>
+      </w:pPr>
+      <w:rPr>
+        <w:rFonts w:ascii="Symbol" w:hAnsi="Symbol" w:hint="default"/>
+      </w:rPr>
+    </w:lvl>
+    <w:lvl w:ilvl="4" w:tplc="08090003" w:tentative="1">
+      <w:start w:val="1"/>
+      <w:numFmt w:val="bullet"/>
+      <w:lvlText w:val="o"/>
+      <w:lvlJc w:val="left"/>
+      <w:pPr>
+        <w:ind w:left="3600" w:hanging="360"/>
+      </w:pPr>
+      <w:rPr>
+        <w:rFonts w:ascii="Courier New" w:hAnsi="Courier New" w:cs="Courier New" w:hint="default"/>
+      </w:rPr>
+    </w:lvl>
+    <w:lvl w:ilvl="5" w:tplc="08090005" w:tentative="1">
+      <w:start w:val="1"/>
+      <w:numFmt w:val="bullet"/>
+      <w:lvlText w:val=""/>
+      <w:lvlJc w:val="left"/>
+      <w:pPr>
+        <w:ind w:left="4320" w:hanging="360"/>
+      </w:pPr>
+      <w:rPr>
+        <w:rFonts w:ascii="Wingdings" w:hAnsi="Wingdings" w:hint="default"/>
+      </w:rPr>
+    </w:lvl>
+    <w:lvl w:ilvl="6" w:tplc="08090001" w:tentative="1">
+      <w:start w:val="1"/>
+      <w:numFmt w:val="bullet"/>
+      <w:lvlText w:val=""/>
+      <w:lvlJc w:val="left"/>
+      <w:pPr>
+        <w:ind w:left="5040" w:hanging="360"/>
+      </w:pPr>
+      <w:rPr>
+        <w:rFonts w:ascii="Symbol" w:hAnsi="Symbol" w:hint="default"/>
+      </w:rPr>
+    </w:lvl>
+    <w:lvl w:ilvl="7" w:tplc="08090003" w:tentative="1">
+      <w:start w:val="1"/>
+      <w:numFmt w:val="bullet"/>
+      <w:lvlText w:val="o"/>
+      <w:lvlJc w:val="left"/>
+      <w:pPr>
+        <w:ind w:left="5760" w:hanging="360"/>
+      </w:pPr>
+      <w:rPr>
+        <w:rFonts w:ascii="Courier New" w:hAnsi="Courier New" w:cs="Courier New" w:hint="default"/>
+      </w:rPr>
+    </w:lvl>
+    <w:lvl w:ilvl="8" w:tplc="08090005" w:tentative="1">
+      <w:start w:val="1"/>
+      <w:numFmt w:val="bullet"/>
+      <w:lvlText w:val=""/>
+      <w:lvlJc w:val="left"/>
+      <w:pPr>
+        <w:ind w:left="6480" w:hanging="360"/>
+      </w:pPr>
+      <w:rPr>
+        <w:rFonts w:ascii="Wingdings" w:hAnsi="Wingdings" w:hint="default"/>
+      </w:rPr>
+    </w:lvl>
+  </w:abstractNum>
+  <w:abstractNum w:abstractNumId="25" w15:restartNumberingAfterBreak="0">
     <w:nsid w:val="73A72ABD"/>
     <w:multiLevelType w:val="hybridMultilevel"/>
     <w:tmpl w:val="93B2B46C"/>
@@ -2942,10 +5224,123 @@
       </w:rPr>
     </w:lvl>
   </w:abstractNum>
-  <w:abstractNum w:abstractNumId="16" w15:restartNumberingAfterBreak="0">
+  <w:abstractNum w:abstractNumId="26" w15:restartNumberingAfterBreak="0">
+    <w:nsid w:val="77832A19"/>
+    <w:multiLevelType w:val="hybridMultilevel"/>
+    <w:tmpl w:val="88500EAA"/>
+    <w:lvl w:ilvl="0" w:tplc="08090001">
+      <w:start w:val="1"/>
+      <w:numFmt w:val="bullet"/>
+      <w:lvlText w:val=""/>
+      <w:lvlJc w:val="left"/>
+      <w:pPr>
+        <w:ind w:left="720" w:hanging="360"/>
+      </w:pPr>
+      <w:rPr>
+        <w:rFonts w:ascii="Symbol" w:hAnsi="Symbol" w:hint="default"/>
+      </w:rPr>
+    </w:lvl>
+    <w:lvl w:ilvl="1" w:tplc="08090003" w:tentative="1">
+      <w:start w:val="1"/>
+      <w:numFmt w:val="bullet"/>
+      <w:lvlText w:val="o"/>
+      <w:lvlJc w:val="left"/>
+      <w:pPr>
+        <w:ind w:left="1440" w:hanging="360"/>
+      </w:pPr>
+      <w:rPr>
+        <w:rFonts w:ascii="Courier New" w:hAnsi="Courier New" w:cs="Courier New" w:hint="default"/>
+      </w:rPr>
+    </w:lvl>
+    <w:lvl w:ilvl="2" w:tplc="08090005" w:tentative="1">
+      <w:start w:val="1"/>
+      <w:numFmt w:val="bullet"/>
+      <w:lvlText w:val=""/>
+      <w:lvlJc w:val="left"/>
+      <w:pPr>
+        <w:ind w:left="2160" w:hanging="360"/>
+      </w:pPr>
+      <w:rPr>
+        <w:rFonts w:ascii="Wingdings" w:hAnsi="Wingdings" w:hint="default"/>
+      </w:rPr>
+    </w:lvl>
+    <w:lvl w:ilvl="3" w:tplc="08090001" w:tentative="1">
+      <w:start w:val="1"/>
+      <w:numFmt w:val="bullet"/>
+      <w:lvlText w:val=""/>
+      <w:lvlJc w:val="left"/>
+      <w:pPr>
+        <w:ind w:left="2880" w:hanging="360"/>
+      </w:pPr>
+      <w:rPr>
+        <w:rFonts w:ascii="Symbol" w:hAnsi="Symbol" w:hint="default"/>
+      </w:rPr>
+    </w:lvl>
+    <w:lvl w:ilvl="4" w:tplc="08090003" w:tentative="1">
+      <w:start w:val="1"/>
+      <w:numFmt w:val="bullet"/>
+      <w:lvlText w:val="o"/>
+      <w:lvlJc w:val="left"/>
+      <w:pPr>
+        <w:ind w:left="3600" w:hanging="360"/>
+      </w:pPr>
+      <w:rPr>
+        <w:rFonts w:ascii="Courier New" w:hAnsi="Courier New" w:cs="Courier New" w:hint="default"/>
+      </w:rPr>
+    </w:lvl>
+    <w:lvl w:ilvl="5" w:tplc="08090005" w:tentative="1">
+      <w:start w:val="1"/>
+      <w:numFmt w:val="bullet"/>
+      <w:lvlText w:val=""/>
+      <w:lvlJc w:val="left"/>
+      <w:pPr>
+        <w:ind w:left="4320" w:hanging="360"/>
+      </w:pPr>
+      <w:rPr>
+        <w:rFonts w:ascii="Wingdings" w:hAnsi="Wingdings" w:hint="default"/>
+      </w:rPr>
+    </w:lvl>
+    <w:lvl w:ilvl="6" w:tplc="08090001" w:tentative="1">
+      <w:start w:val="1"/>
+      <w:numFmt w:val="bullet"/>
+      <w:lvlText w:val=""/>
+      <w:lvlJc w:val="left"/>
+      <w:pPr>
+        <w:ind w:left="5040" w:hanging="360"/>
+      </w:pPr>
+      <w:rPr>
+        <w:rFonts w:ascii="Symbol" w:hAnsi="Symbol" w:hint="default"/>
+      </w:rPr>
+    </w:lvl>
+    <w:lvl w:ilvl="7" w:tplc="08090003" w:tentative="1">
+      <w:start w:val="1"/>
+      <w:numFmt w:val="bullet"/>
+      <w:lvlText w:val="o"/>
+      <w:lvlJc w:val="left"/>
+      <w:pPr>
+        <w:ind w:left="5760" w:hanging="360"/>
+      </w:pPr>
+      <w:rPr>
+        <w:rFonts w:ascii="Courier New" w:hAnsi="Courier New" w:cs="Courier New" w:hint="default"/>
+      </w:rPr>
+    </w:lvl>
+    <w:lvl w:ilvl="8" w:tplc="08090005" w:tentative="1">
+      <w:start w:val="1"/>
+      <w:numFmt w:val="bullet"/>
+      <w:lvlText w:val=""/>
+      <w:lvlJc w:val="left"/>
+      <w:pPr>
+        <w:ind w:left="6480" w:hanging="360"/>
+      </w:pPr>
+      <w:rPr>
+        <w:rFonts w:ascii="Wingdings" w:hAnsi="Wingdings" w:hint="default"/>
+      </w:rPr>
+    </w:lvl>
+  </w:abstractNum>
+  <w:abstractNum w:abstractNumId="27" w15:restartNumberingAfterBreak="0">
     <w:nsid w:val="7C0F19FC"/>
     <w:multiLevelType w:val="hybridMultilevel"/>
-    <w:tmpl w:val="2CDA247A"/>
+    <w:tmpl w:val="B80C5320"/>
     <w:lvl w:ilvl="0" w:tplc="08090001">
       <w:start w:val="1"/>
       <w:numFmt w:val="bullet"/>
@@ -2958,7 +5353,7 @@
         <w:rFonts w:ascii="Symbol" w:hAnsi="Symbol" w:hint="default"/>
       </w:rPr>
     </w:lvl>
-    <w:lvl w:ilvl="1" w:tplc="08090003" w:tentative="1">
+    <w:lvl w:ilvl="1" w:tplc="08090003">
       <w:start w:val="1"/>
       <w:numFmt w:val="bullet"/>
       <w:lvlText w:val="o"/>
@@ -3083,28 +5478,61 @@
     <w:abstractNumId w:val="0"/>
   </w:num>
   <w:num w:numId="10" w16cid:durableId="1964993270">
-    <w:abstractNumId w:val="10"/>
+    <w:abstractNumId w:val="11"/>
   </w:num>
   <w:num w:numId="11" w16cid:durableId="1796021297">
-    <w:abstractNumId w:val="11"/>
+    <w:abstractNumId w:val="15"/>
   </w:num>
   <w:num w:numId="12" w16cid:durableId="1967007688">
-    <w:abstractNumId w:val="14"/>
+    <w:abstractNumId w:val="23"/>
   </w:num>
   <w:num w:numId="13" w16cid:durableId="260719056">
     <w:abstractNumId w:val="9"/>
   </w:num>
   <w:num w:numId="14" w16cid:durableId="111825312">
+    <w:abstractNumId w:val="17"/>
+  </w:num>
+  <w:num w:numId="15" w16cid:durableId="574586527">
+    <w:abstractNumId w:val="25"/>
+  </w:num>
+  <w:num w:numId="16" w16cid:durableId="404838811">
+    <w:abstractNumId w:val="19"/>
+  </w:num>
+  <w:num w:numId="17" w16cid:durableId="45840448">
+    <w:abstractNumId w:val="27"/>
+  </w:num>
+  <w:num w:numId="18" w16cid:durableId="1412697140">
+    <w:abstractNumId w:val="14"/>
+  </w:num>
+  <w:num w:numId="19" w16cid:durableId="1216816277">
     <w:abstractNumId w:val="12"/>
   </w:num>
-  <w:num w:numId="15" w16cid:durableId="574586527">
-    <w:abstractNumId w:val="15"/>
+  <w:num w:numId="20" w16cid:durableId="590747617">
+    <w:abstractNumId w:val="22"/>
   </w:num>
-  <w:num w:numId="16" w16cid:durableId="404838811">
+  <w:num w:numId="21" w16cid:durableId="2095785475">
+    <w:abstractNumId w:val="26"/>
+  </w:num>
+  <w:num w:numId="22" w16cid:durableId="561526050">
     <w:abstractNumId w:val="13"/>
   </w:num>
-  <w:num w:numId="17" w16cid:durableId="45840448">
+  <w:num w:numId="23" w16cid:durableId="62412562">
+    <w:abstractNumId w:val="10"/>
+  </w:num>
+  <w:num w:numId="24" w16cid:durableId="774327747">
+    <w:abstractNumId w:val="24"/>
+  </w:num>
+  <w:num w:numId="25" w16cid:durableId="115105112">
     <w:abstractNumId w:val="16"/>
+  </w:num>
+  <w:num w:numId="26" w16cid:durableId="723597884">
+    <w:abstractNumId w:val="20"/>
+  </w:num>
+  <w:num w:numId="27" w16cid:durableId="1303459131">
+    <w:abstractNumId w:val="18"/>
+  </w:num>
+  <w:num w:numId="28" w16cid:durableId="1073242207">
+    <w:abstractNumId w:val="21"/>
   </w:num>
 </w:numbering>
 </file>

</xml_diff>

<commit_message>
Move relevant files into docs folder to be displayed on website
</commit_message>
<xml_diff>
--- a/FERTILITY_Invisible_Journeys_Terms_and_Conditions.docx
+++ b/FERTILITY_Invisible_Journeys_Terms_and_Conditions.docx
@@ -1020,7 +1020,6 @@
       <w:r>
         <w:rPr>
           <w:color w:val="000000" w:themeColor="text1"/>
-          <w:highlight w:val="yellow"/>
         </w:rPr>
         <w:t>14 November</w:t>
       </w:r>
@@ -1117,14 +1116,12 @@
         </w:numPr>
         <w:rPr>
           <w:color w:val="000000" w:themeColor="text1"/>
-          <w:highlight w:val="yellow"/>
         </w:rPr>
       </w:pPr>
       <w:r>
         <w:rPr>
           <w:b/>
           <w:color w:val="000000" w:themeColor="text1"/>
-          <w:highlight w:val="yellow"/>
         </w:rPr>
         <w:t xml:space="preserve">Submission </w:t>
       </w:r>
@@ -1133,21 +1130,14 @@
         <w:rPr>
           <w:b/>
           <w:color w:val="000000" w:themeColor="text1"/>
-          <w:highlight w:val="yellow"/>
         </w:rPr>
         <w:t xml:space="preserve">deadline  </w:t>
       </w:r>
       <w:r>
-        <w:rPr>
-          <w:highlight w:val="yellow"/>
-        </w:rPr>
         <w:t>Friday</w:t>
       </w:r>
       <w:proofErr w:type="gramEnd"/>
       <w:r>
-        <w:rPr>
-          <w:highlight w:val="yellow"/>
-        </w:rPr>
         <w:t xml:space="preserve"> 9 October 2026, 23:59</w:t>
       </w:r>
     </w:p>
@@ -1160,14 +1150,12 @@
         </w:numPr>
         <w:rPr>
           <w:color w:val="000000" w:themeColor="text1"/>
-          <w:highlight w:val="yellow"/>
         </w:rPr>
       </w:pPr>
       <w:r>
         <w:rPr>
           <w:b/>
           <w:color w:val="000000" w:themeColor="text1"/>
-          <w:highlight w:val="yellow"/>
         </w:rPr>
         <w:t xml:space="preserve">Notification of </w:t>
       </w:r>
@@ -1176,14 +1164,12 @@
         <w:rPr>
           <w:b/>
           <w:color w:val="000000" w:themeColor="text1"/>
-          <w:highlight w:val="yellow"/>
         </w:rPr>
         <w:t xml:space="preserve">selection  </w:t>
       </w:r>
       <w:r>
         <w:rPr>
           <w:color w:val="000000" w:themeColor="text1"/>
-          <w:highlight w:val="yellow"/>
         </w:rPr>
         <w:t>Sunday</w:t>
       </w:r>
@@ -1191,7 +1177,6 @@
       <w:r>
         <w:rPr>
           <w:color w:val="000000" w:themeColor="text1"/>
-          <w:highlight w:val="yellow"/>
         </w:rPr>
         <w:t xml:space="preserve"> 18 October</w:t>
       </w:r>
@@ -1205,14 +1190,12 @@
         </w:numPr>
         <w:rPr>
           <w:color w:val="000000" w:themeColor="text1"/>
-          <w:highlight w:val="yellow"/>
         </w:rPr>
       </w:pPr>
       <w:r>
         <w:rPr>
           <w:b/>
           <w:color w:val="000000" w:themeColor="text1"/>
-          <w:highlight w:val="yellow"/>
         </w:rPr>
         <w:t xml:space="preserve">Delivery of </w:t>
       </w:r>
@@ -1221,14 +1204,12 @@
         <w:rPr>
           <w:b/>
           <w:color w:val="000000" w:themeColor="text1"/>
-          <w:highlight w:val="yellow"/>
         </w:rPr>
         <w:t xml:space="preserve">work  </w:t>
       </w:r>
       <w:r>
         <w:rPr>
           <w:color w:val="000000" w:themeColor="text1"/>
-          <w:highlight w:val="yellow"/>
         </w:rPr>
         <w:t>Saturday</w:t>
       </w:r>
@@ -1236,7 +1217,6 @@
       <w:r>
         <w:rPr>
           <w:color w:val="000000" w:themeColor="text1"/>
-          <w:highlight w:val="yellow"/>
         </w:rPr>
         <w:t xml:space="preserve"> 14 November, 10am–2pm</w:t>
       </w:r>
@@ -1250,14 +1230,12 @@
         </w:numPr>
         <w:rPr>
           <w:color w:val="000000" w:themeColor="text1"/>
-          <w:highlight w:val="yellow"/>
         </w:rPr>
       </w:pPr>
       <w:r>
         <w:rPr>
           <w:b/>
           <w:color w:val="000000" w:themeColor="text1"/>
-          <w:highlight w:val="yellow"/>
         </w:rPr>
         <w:t xml:space="preserve">Install </w:t>
       </w:r>
@@ -1266,14 +1244,12 @@
         <w:rPr>
           <w:b/>
           <w:color w:val="000000" w:themeColor="text1"/>
-          <w:highlight w:val="yellow"/>
         </w:rPr>
         <w:t xml:space="preserve">date  </w:t>
       </w:r>
       <w:r>
         <w:rPr>
           <w:color w:val="000000" w:themeColor="text1"/>
-          <w:highlight w:val="yellow"/>
         </w:rPr>
         <w:t>Sunday</w:t>
       </w:r>
@@ -1281,7 +1257,6 @@
       <w:r>
         <w:rPr>
           <w:color w:val="000000" w:themeColor="text1"/>
-          <w:highlight w:val="yellow"/>
         </w:rPr>
         <w:t xml:space="preserve"> 15 November</w:t>
       </w:r>
@@ -1295,7 +1270,6 @@
         </w:numPr>
         <w:rPr>
           <w:color w:val="000000" w:themeColor="text1"/>
-          <w:highlight w:val="yellow"/>
         </w:rPr>
       </w:pPr>
       <w:proofErr w:type="gramStart"/>
@@ -1303,7 +1277,6 @@
         <w:rPr>
           <w:b/>
           <w:color w:val="000000" w:themeColor="text1"/>
-          <w:highlight w:val="yellow"/>
         </w:rPr>
         <w:lastRenderedPageBreak/>
         <w:t xml:space="preserve">Exhibition  </w:t>
@@ -1311,7 +1284,6 @@
       <w:r>
         <w:rPr>
           <w:color w:val="000000" w:themeColor="text1"/>
-          <w:highlight w:val="yellow"/>
         </w:rPr>
         <w:t>Monday</w:t>
       </w:r>
@@ -1319,7 +1291,6 @@
       <w:r>
         <w:rPr>
           <w:color w:val="000000" w:themeColor="text1"/>
-          <w:highlight w:val="yellow"/>
         </w:rPr>
         <w:t xml:space="preserve"> 16 November – Saturday 28 November</w:t>
       </w:r>
@@ -1333,40 +1304,46 @@
         </w:numPr>
         <w:rPr>
           <w:color w:val="000000" w:themeColor="text1"/>
-          <w:highlight w:val="yellow"/>
         </w:rPr>
       </w:pPr>
       <w:r>
         <w:rPr>
           <w:b/>
           <w:color w:val="000000" w:themeColor="text1"/>
-          <w:highlight w:val="yellow"/>
-        </w:rPr>
-        <w:t xml:space="preserve">Private </w:t>
-      </w:r>
-      <w:proofErr w:type="gramStart"/>
-      <w:r>
-        <w:rPr>
-          <w:b/>
-          <w:color w:val="000000" w:themeColor="text1"/>
-          <w:highlight w:val="yellow"/>
-        </w:rPr>
-        <w:t xml:space="preserve">view  </w:t>
-      </w:r>
-      <w:r>
-        <w:rPr>
-          <w:color w:val="000000" w:themeColor="text1"/>
-          <w:highlight w:val="yellow"/>
-        </w:rPr>
-        <w:t>Thursday</w:t>
-      </w:r>
-      <w:proofErr w:type="gramEnd"/>
-      <w:r>
-        <w:rPr>
-          <w:color w:val="000000" w:themeColor="text1"/>
-          <w:highlight w:val="yellow"/>
-        </w:rPr>
-        <w:t xml:space="preserve"> 19 November</w:t>
+        </w:rPr>
+        <w:t xml:space="preserve">Private view  </w:t>
+      </w:r>
+      <w:r>
+        <w:rPr>
+          <w:color w:val="000000" w:themeColor="text1"/>
+        </w:rPr>
+        <w:t>Thursday 19 November</w:t>
+      </w:r>
+      <w:r>
+        <w:rPr>
+          <w:color w:val="000000" w:themeColor="text1"/>
+        </w:rPr>
+        <w:t>,</w:t>
+      </w:r>
+      <w:r>
+        <w:rPr>
+          <w:color w:val="000000" w:themeColor="text1"/>
+        </w:rPr>
+        <w:t xml:space="preserve"> 5 to </w:t>
+      </w:r>
+      <w:proofErr w:type="spellStart"/>
+      <w:r>
+        <w:rPr>
+          <w:color w:val="000000" w:themeColor="text1"/>
+        </w:rPr>
+        <w:t>8</w:t>
+      </w:r>
+      <w:proofErr w:type="spellEnd"/>
+      <w:r>
+        <w:rPr>
+          <w:color w:val="000000" w:themeColor="text1"/>
+        </w:rPr>
+        <w:t xml:space="preserve"> pm</w:t>
       </w:r>
     </w:p>
     <w:p>
@@ -1384,7 +1361,6 @@
         <w:rPr>
           <w:b/>
           <w:color w:val="000000" w:themeColor="text1"/>
-          <w:highlight w:val="yellow"/>
         </w:rPr>
         <w:t xml:space="preserve">Take down and collection of </w:t>
       </w:r>
@@ -1393,14 +1369,12 @@
         <w:rPr>
           <w:b/>
           <w:color w:val="000000" w:themeColor="text1"/>
-          <w:highlight w:val="yellow"/>
         </w:rPr>
         <w:t xml:space="preserve">work  </w:t>
       </w:r>
       <w:r>
         <w:rPr>
           <w:color w:val="000000" w:themeColor="text1"/>
-          <w:highlight w:val="yellow"/>
         </w:rPr>
         <w:t>Sunday</w:t>
       </w:r>
@@ -1408,7 +1382,6 @@
       <w:r>
         <w:rPr>
           <w:color w:val="000000" w:themeColor="text1"/>
-          <w:highlight w:val="yellow"/>
         </w:rPr>
         <w:t xml:space="preserve"> 29 November</w:t>
       </w:r>
@@ -2175,20 +2148,13 @@
         <w:rPr>
           <w:color w:val="000000" w:themeColor="text1"/>
         </w:rPr>
-        <w:t xml:space="preserve">Delivery is scheduled for </w:t>
-      </w:r>
-      <w:r>
-        <w:rPr>
-          <w:color w:val="000000" w:themeColor="text1"/>
-          <w:highlight w:val="yellow"/>
-        </w:rPr>
-        <w:t>Saturday 14 November,</w:t>
-      </w:r>
-      <w:r>
-        <w:rPr>
-          <w:color w:val="000000" w:themeColor="text1"/>
-        </w:rPr>
-        <w:t xml:space="preserve"> from 10am to 2pm, at Oaklands Social.</w:t>
+        <w:t xml:space="preserve">Delivery is scheduled </w:t>
+      </w:r>
+      <w:r>
+        <w:rPr>
+          <w:color w:val="000000" w:themeColor="text1"/>
+        </w:rPr>
+        <w:t>for Saturday 14 November, from 10am to 2pm, at Oaklands Social.</w:t>
       </w:r>
     </w:p>
     <w:p>
@@ -2203,13 +2169,7 @@
         </w:rPr>
       </w:pPr>
       <w:r>
-        <w:t xml:space="preserve">Collection will take place on </w:t>
-      </w:r>
-      <w:r>
-        <w:rPr>
-          <w:highlight w:val="yellow"/>
-        </w:rPr>
-        <w:t>Sunday 29 November</w:t>
+        <w:t>Collection will take place on Sunday 29 November</w:t>
       </w:r>
       <w:r>
         <w:t xml:space="preserve"> at the same location from 10am to 2pm.</w:t>

</xml_diff>